<commit_message>
listo para entrega final
</commit_message>
<xml_diff>
--- a/Docs/Observaciones-Lab6.docx
+++ b/Docs/Observaciones-Lab6.docx
@@ -55,14 +55,28 @@
           <w:noProof w:val="0"/>
           <w:lang w:val="es-CO"/>
         </w:rPr>
-        <w:t xml:space="preserve">Estudiante </w:t>
+        <w:t>Alvaro Andres Villate Leon</w:t>
       </w:r>
       <w:r>
         <w:rPr>
           <w:noProof w:val="0"/>
           <w:lang w:val="es-CO"/>
         </w:rPr>
-        <w:t>1 Cod XXXX</w:t>
+        <w:t xml:space="preserve"> </w:t>
+      </w:r>
+      <w:r>
+        <w:rPr>
+          <w:noProof w:val="0"/>
+          <w:lang w:val="es-CO"/>
+        </w:rPr>
+        <w:t xml:space="preserve">1 </w:t>
+      </w:r>
+      <w:r>
+        <w:rPr>
+          <w:noProof w:val="0"/>
+          <w:lang w:val="es-CO"/>
+        </w:rPr>
+        <w:t>202616607</w:t>
       </w:r>
     </w:p>
     <w:p>
@@ -224,6 +238,13 @@
                 <w:lang w:val="es-419"/>
               </w:rPr>
             </w:pPr>
+            <w:r>
+              <w:rPr>
+                <w:rFonts w:ascii="Dax-Regular" w:hAnsi="Dax-Regular"/>
+                <w:lang w:val="es-419"/>
+              </w:rPr>
+              <w:t>RYZEN 5 3600</w:t>
+            </w:r>
           </w:p>
         </w:tc>
       </w:tr>
@@ -266,6 +287,13 @@
                 <w:lang w:val="es-419"/>
               </w:rPr>
             </w:pPr>
+            <w:r>
+              <w:rPr>
+                <w:rFonts w:ascii="Dax-Regular" w:hAnsi="Dax-Regular"/>
+                <w:lang w:val="es-419"/>
+              </w:rPr>
+              <w:t>16</w:t>
+            </w:r>
           </w:p>
         </w:tc>
       </w:tr>
@@ -309,6 +337,13 @@
                 <w:lang w:val="es-419"/>
               </w:rPr>
             </w:pPr>
+            <w:r>
+              <w:rPr>
+                <w:rFonts w:ascii="Dax-Regular" w:hAnsi="Dax-Regular"/>
+                <w:lang w:val="es-419"/>
+              </w:rPr>
+              <w:t>Windows 11 pro</w:t>
+            </w:r>
           </w:p>
         </w:tc>
       </w:tr>
@@ -652,6 +687,14 @@
                 <w:lang w:val="es-419"/>
               </w:rPr>
             </w:pPr>
+            <w:r>
+              <w:rPr>
+                <w:rFonts w:ascii="Calibri" w:eastAsia="Times New Roman" w:hAnsi="Calibri" w:cs="Calibri"/>
+                <w:color w:val="000000"/>
+                <w:lang w:val="es-419"/>
+              </w:rPr>
+              <w:t>817303.46</w:t>
+            </w:r>
           </w:p>
         </w:tc>
         <w:tc>
@@ -677,6 +720,14 @@
                 <w:lang w:val="es-419"/>
               </w:rPr>
             </w:pPr>
+            <w:r>
+              <w:rPr>
+                <w:rFonts w:ascii="Calibri" w:eastAsia="Times New Roman" w:hAnsi="Calibri" w:cs="Calibri"/>
+                <w:color w:val="000000"/>
+                <w:lang w:val="es-419"/>
+              </w:rPr>
+              <w:t>34316.24</w:t>
+            </w:r>
           </w:p>
         </w:tc>
       </w:tr>
@@ -737,6 +788,14 @@
                 <w:lang w:val="es-419"/>
               </w:rPr>
             </w:pPr>
+            <w:r>
+              <w:rPr>
+                <w:rFonts w:ascii="Calibri" w:eastAsia="Times New Roman" w:hAnsi="Calibri" w:cs="Calibri"/>
+                <w:color w:val="000000"/>
+                <w:lang w:val="es-419"/>
+              </w:rPr>
+              <w:t>575631.58</w:t>
+            </w:r>
           </w:p>
         </w:tc>
         <w:tc>
@@ -761,6 +820,14 @@
                 <w:lang w:val="es-419"/>
               </w:rPr>
             </w:pPr>
+            <w:r>
+              <w:rPr>
+                <w:rFonts w:ascii="Calibri" w:eastAsia="Times New Roman" w:hAnsi="Calibri" w:cs="Calibri"/>
+                <w:color w:val="000000"/>
+                <w:lang w:val="es-419"/>
+              </w:rPr>
+              <w:t>28390.77</w:t>
+            </w:r>
           </w:p>
         </w:tc>
       </w:tr>
@@ -821,6 +888,14 @@
                 <w:lang w:val="es-419"/>
               </w:rPr>
             </w:pPr>
+            <w:r>
+              <w:rPr>
+                <w:rFonts w:ascii="Calibri" w:eastAsia="Times New Roman" w:hAnsi="Calibri" w:cs="Calibri"/>
+                <w:color w:val="000000"/>
+                <w:lang w:val="es-419"/>
+              </w:rPr>
+              <w:t>558909.76</w:t>
+            </w:r>
           </w:p>
         </w:tc>
         <w:tc>
@@ -845,6 +920,14 @@
                 <w:lang w:val="es-419"/>
               </w:rPr>
             </w:pPr>
+            <w:r>
+              <w:rPr>
+                <w:rFonts w:ascii="Calibri" w:eastAsia="Times New Roman" w:hAnsi="Calibri" w:cs="Calibri"/>
+                <w:color w:val="000000"/>
+                <w:lang w:val="es-419"/>
+              </w:rPr>
+              <w:t>28117.58</w:t>
+            </w:r>
           </w:p>
         </w:tc>
       </w:tr>
@@ -905,6 +988,14 @@
                 <w:lang w:val="es-419"/>
               </w:rPr>
             </w:pPr>
+            <w:r>
+              <w:rPr>
+                <w:rFonts w:ascii="Calibri" w:eastAsia="Times New Roman" w:hAnsi="Calibri" w:cs="Calibri"/>
+                <w:color w:val="000000"/>
+                <w:lang w:val="es-419"/>
+              </w:rPr>
+              <w:t>549734.97</w:t>
+            </w:r>
           </w:p>
         </w:tc>
         <w:tc>
@@ -929,6 +1020,14 @@
                 <w:lang w:val="es-419"/>
               </w:rPr>
             </w:pPr>
+            <w:r>
+              <w:rPr>
+                <w:rFonts w:ascii="Calibri" w:eastAsia="Times New Roman" w:hAnsi="Calibri" w:cs="Calibri"/>
+                <w:color w:val="000000"/>
+                <w:lang w:val="es-419"/>
+              </w:rPr>
+              <w:t>28822.06</w:t>
+            </w:r>
           </w:p>
         </w:tc>
       </w:tr>
@@ -1265,7 +1364,7 @@
               <w:right w:val="nil"/>
             </w:tcBorders>
             <w:shd w:val="clear" w:color="D9D9D9" w:fill="D9D9D9"/>
-            <w:vAlign w:val="center"/>
+            <w:vAlign w:val="bottom"/>
           </w:tcPr>
           <w:p>
             <w:pPr>
@@ -1277,6 +1376,13 @@
                 <w:lang w:val="es-419"/>
               </w:rPr>
             </w:pPr>
+            <w:r>
+              <w:rPr>
+                <w:rFonts w:ascii="Calibri" w:hAnsi="Calibri" w:cs="Calibri"/>
+                <w:color w:val="000000"/>
+              </w:rPr>
+              <w:t>620450.3</w:t>
+            </w:r>
           </w:p>
         </w:tc>
         <w:tc>
@@ -1301,6 +1407,13 @@
                 <w:lang w:val="es-419"/>
               </w:rPr>
             </w:pPr>
+            <w:r>
+              <w:rPr>
+                <w:rFonts w:ascii="Calibri" w:hAnsi="Calibri" w:cs="Calibri"/>
+                <w:color w:val="000000"/>
+              </w:rPr>
+              <w:t>31250.45</w:t>
+            </w:r>
           </w:p>
         </w:tc>
       </w:tr>
@@ -1349,7 +1462,7 @@
               <w:bottom w:val="nil"/>
               <w:right w:val="nil"/>
             </w:tcBorders>
-            <w:vAlign w:val="center"/>
+            <w:vAlign w:val="bottom"/>
           </w:tcPr>
           <w:p>
             <w:pPr>
@@ -1361,6 +1474,13 @@
                 <w:lang w:val="es-419"/>
               </w:rPr>
             </w:pPr>
+            <w:r>
+              <w:rPr>
+                <w:rFonts w:ascii="Calibri" w:hAnsi="Calibri" w:cs="Calibri"/>
+                <w:color w:val="000000"/>
+              </w:rPr>
+              <w:t>598120.15</w:t>
+            </w:r>
           </w:p>
         </w:tc>
         <w:tc>
@@ -1372,7 +1492,7 @@
               <w:bottom w:val="nil"/>
               <w:right w:val="nil"/>
             </w:tcBorders>
-            <w:vAlign w:val="center"/>
+            <w:vAlign w:val="bottom"/>
           </w:tcPr>
           <w:p>
             <w:pPr>
@@ -1384,6 +1504,13 @@
                 <w:lang w:val="es-419"/>
               </w:rPr>
             </w:pPr>
+            <w:r>
+              <w:rPr>
+                <w:rFonts w:ascii="Calibri" w:hAnsi="Calibri" w:cs="Calibri"/>
+                <w:color w:val="000000"/>
+              </w:rPr>
+              <w:t>32890.1</w:t>
+            </w:r>
           </w:p>
         </w:tc>
       </w:tr>
@@ -1434,7 +1561,7 @@
               <w:right w:val="nil"/>
             </w:tcBorders>
             <w:shd w:val="clear" w:color="D9D9D9" w:fill="D9D9D9"/>
-            <w:vAlign w:val="center"/>
+            <w:vAlign w:val="bottom"/>
           </w:tcPr>
           <w:p>
             <w:pPr>
@@ -1446,6 +1573,13 @@
                 <w:lang w:val="es-419"/>
               </w:rPr>
             </w:pPr>
+            <w:r>
+              <w:rPr>
+                <w:rFonts w:ascii="Calibri" w:hAnsi="Calibri" w:cs="Calibri"/>
+                <w:color w:val="000000"/>
+              </w:rPr>
+              <w:t>585340.8</w:t>
+            </w:r>
           </w:p>
         </w:tc>
         <w:tc>
@@ -1458,7 +1592,7 @@
               <w:right w:val="nil"/>
             </w:tcBorders>
             <w:shd w:val="clear" w:color="D9D9D9" w:fill="D9D9D9"/>
-            <w:vAlign w:val="center"/>
+            <w:vAlign w:val="bottom"/>
           </w:tcPr>
           <w:p>
             <w:pPr>
@@ -1471,6 +1605,13 @@
                 <w:lang w:val="es-419"/>
               </w:rPr>
             </w:pPr>
+            <w:r>
+              <w:rPr>
+                <w:rFonts w:ascii="Calibri" w:hAnsi="Calibri" w:cs="Calibri"/>
+                <w:color w:val="000000"/>
+              </w:rPr>
+              <w:t>34100.65</w:t>
+            </w:r>
           </w:p>
         </w:tc>
       </w:tr>
@@ -1519,7 +1660,7 @@
               <w:bottom w:val="single" w:sz="4" w:space="0" w:color="000000"/>
               <w:right w:val="nil"/>
             </w:tcBorders>
-            <w:vAlign w:val="center"/>
+            <w:vAlign w:val="bottom"/>
           </w:tcPr>
           <w:p>
             <w:pPr>
@@ -1531,6 +1672,13 @@
                 <w:lang w:val="es-419"/>
               </w:rPr>
             </w:pPr>
+            <w:r>
+              <w:rPr>
+                <w:rFonts w:ascii="Calibri" w:hAnsi="Calibri" w:cs="Calibri"/>
+                <w:color w:val="000000"/>
+              </w:rPr>
+              <w:t>579210.4</w:t>
+            </w:r>
           </w:p>
         </w:tc>
         <w:tc>
@@ -1542,7 +1690,7 @@
               <w:bottom w:val="single" w:sz="4" w:space="0" w:color="000000"/>
               <w:right w:val="nil"/>
             </w:tcBorders>
-            <w:vAlign w:val="center"/>
+            <w:vAlign w:val="bottom"/>
           </w:tcPr>
           <w:p>
             <w:pPr>
@@ -1554,6 +1702,13 @@
                 <w:lang w:val="es-419"/>
               </w:rPr>
             </w:pPr>
+            <w:r>
+              <w:rPr>
+                <w:rFonts w:ascii="Calibri" w:hAnsi="Calibri" w:cs="Calibri"/>
+                <w:color w:val="000000"/>
+              </w:rPr>
+              <w:t>35680.2</w:t>
+            </w:r>
           </w:p>
         </w:tc>
       </w:tr>
@@ -1928,6 +2083,7 @@
           <w:ilvl w:val="0"/>
           <w:numId w:val="13"/>
         </w:numPr>
+        <w:ind w:left="680"/>
         <w:jc w:val="both"/>
         <w:rPr>
           <w:lang w:val="es-419"/>
@@ -1939,50 +2095,714 @@
         </w:rPr>
         <w:t xml:space="preserve">¿Por qué en la función </w:t>
       </w:r>
+      <w:proofErr w:type="spellStart"/>
       <w:r>
         <w:rPr>
           <w:b/>
           <w:bCs/>
           <w:lang w:val="es-419"/>
         </w:rPr>
-        <w:t>getTime()</w:t>
-      </w:r>
-      <w:r>
-        <w:rPr>
-          <w:lang w:val="es-419"/>
-        </w:rPr>
-        <w:t xml:space="preserve"> se utiliza </w:t>
-      </w:r>
+        <w:t>getTime</w:t>
+      </w:r>
+      <w:proofErr w:type="spellEnd"/>
       <w:r>
         <w:rPr>
           <w:b/>
           <w:bCs/>
           <w:lang w:val="es-419"/>
         </w:rPr>
-        <w:t>time.perf_counter()</w:t>
+        <w:t>()</w:t>
       </w:r>
       <w:r>
         <w:rPr>
           <w:lang w:val="es-419"/>
         </w:rPr>
-        <w:t xml:space="preserve"> en vez de otras funciones como </w:t>
-      </w:r>
+        <w:t xml:space="preserve"> se utiliza </w:t>
+      </w:r>
+      <w:proofErr w:type="spellStart"/>
       <w:r>
         <w:rPr>
           <w:b/>
           <w:bCs/>
           <w:lang w:val="es-419"/>
         </w:rPr>
-        <w:t>time.process_time()</w:t>
-      </w:r>
-      <w:r>
-        <w:rPr>
+        <w:t>time.perf_counter</w:t>
+      </w:r>
+      <w:proofErr w:type="spellEnd"/>
+      <w:r>
+        <w:rPr>
+          <w:b/>
+          <w:bCs/>
           <w:lang w:val="es-419"/>
         </w:rPr>
+        <w:t>()</w:t>
+      </w:r>
+      <w:r>
+        <w:rPr>
+          <w:lang w:val="es-419"/>
+        </w:rPr>
+        <w:t xml:space="preserve"> en vez de otras funciones como </w:t>
+      </w:r>
+      <w:proofErr w:type="spellStart"/>
+      <w:r>
+        <w:rPr>
+          <w:b/>
+          <w:bCs/>
+          <w:lang w:val="es-419"/>
+        </w:rPr>
+        <w:t>time.process_time</w:t>
+      </w:r>
+      <w:proofErr w:type="spellEnd"/>
+      <w:r>
+        <w:rPr>
+          <w:b/>
+          <w:bCs/>
+          <w:lang w:val="es-419"/>
+        </w:rPr>
+        <w:t>()</w:t>
+      </w:r>
+      <w:r>
+        <w:rPr>
+          <w:lang w:val="es-419"/>
+        </w:rPr>
         <w:t>?</w:t>
       </w:r>
-      <w:r>
-        <w:rPr>
+    </w:p>
+    <w:p>
+      <w:pPr>
+        <w:pStyle w:val="Prrafodelista"/>
+        <w:ind w:left="680" w:firstLine="680"/>
+        <w:rPr>
+          <w:lang w:val="es-419"/>
+        </w:rPr>
+      </w:pPr>
+    </w:p>
+    <w:p>
+      <w:pPr>
+        <w:pStyle w:val="Prrafodelista"/>
+        <w:ind w:left="680" w:firstLine="680"/>
+        <w:rPr>
+          <w:rFonts w:ascii="Times New Roman" w:hAnsi="Times New Roman" w:cs="Times New Roman"/>
+          <w:lang w:val="es-419"/>
+        </w:rPr>
+      </w:pPr>
+      <w:proofErr w:type="spellStart"/>
+      <w:r>
+        <w:rPr>
+          <w:rFonts w:ascii="Times New Roman" w:hAnsi="Times New Roman" w:cs="Times New Roman"/>
+        </w:rPr>
+        <w:t>sobre</w:t>
+      </w:r>
+      <w:proofErr w:type="spellEnd"/>
+      <w:r>
+        <w:rPr>
+          <w:rFonts w:ascii="Times New Roman" w:hAnsi="Times New Roman" w:cs="Times New Roman"/>
+        </w:rPr>
+        <w:t xml:space="preserve"> </w:t>
+      </w:r>
+      <w:proofErr w:type="spellStart"/>
+      <w:r>
+        <w:rPr>
+          <w:rFonts w:ascii="Times New Roman" w:hAnsi="Times New Roman" w:cs="Times New Roman"/>
+        </w:rPr>
+        <w:t>perf_counter</w:t>
+      </w:r>
+      <w:proofErr w:type="spellEnd"/>
+      <w:r>
+        <w:rPr>
+          <w:rFonts w:ascii="Times New Roman" w:hAnsi="Times New Roman" w:cs="Times New Roman"/>
+        </w:rPr>
+        <w:t xml:space="preserve"> vs </w:t>
+      </w:r>
+      <w:proofErr w:type="spellStart"/>
+      <w:r>
+        <w:rPr>
+          <w:rFonts w:ascii="Times New Roman" w:hAnsi="Times New Roman" w:cs="Times New Roman"/>
+        </w:rPr>
+        <w:t>process_time</w:t>
+      </w:r>
+      <w:proofErr w:type="spellEnd"/>
+      <w:r>
+        <w:rPr>
+          <w:rFonts w:ascii="Times New Roman" w:hAnsi="Times New Roman" w:cs="Times New Roman"/>
+        </w:rPr>
+        <w:t xml:space="preserve"> </w:t>
+      </w:r>
+      <w:proofErr w:type="spellStart"/>
+      <w:r>
+        <w:rPr>
+          <w:rFonts w:ascii="Times New Roman" w:hAnsi="Times New Roman" w:cs="Times New Roman"/>
+        </w:rPr>
+        <w:t>usamos</w:t>
+      </w:r>
+      <w:proofErr w:type="spellEnd"/>
+      <w:r>
+        <w:rPr>
+          <w:rFonts w:ascii="Times New Roman" w:hAnsi="Times New Roman" w:cs="Times New Roman"/>
+        </w:rPr>
+        <w:t xml:space="preserve"> </w:t>
+      </w:r>
+      <w:proofErr w:type="spellStart"/>
+      <w:r>
+        <w:rPr>
+          <w:rFonts w:ascii="Times New Roman" w:hAnsi="Times New Roman" w:cs="Times New Roman"/>
+        </w:rPr>
+        <w:t>perf_counter</w:t>
+      </w:r>
+      <w:proofErr w:type="spellEnd"/>
+      <w:r>
+        <w:rPr>
+          <w:rFonts w:ascii="Times New Roman" w:hAnsi="Times New Roman" w:cs="Times New Roman"/>
+        </w:rPr>
+        <w:t xml:space="preserve"> </w:t>
+      </w:r>
+      <w:proofErr w:type="spellStart"/>
+      <w:r>
+        <w:rPr>
+          <w:rFonts w:ascii="Times New Roman" w:hAnsi="Times New Roman" w:cs="Times New Roman"/>
+        </w:rPr>
+        <w:t>porque</w:t>
+      </w:r>
+      <w:proofErr w:type="spellEnd"/>
+      <w:r>
+        <w:rPr>
+          <w:rFonts w:ascii="Times New Roman" w:hAnsi="Times New Roman" w:cs="Times New Roman"/>
+        </w:rPr>
+        <w:t xml:space="preserve"> </w:t>
+      </w:r>
+      <w:proofErr w:type="spellStart"/>
+      <w:r>
+        <w:rPr>
+          <w:rFonts w:ascii="Times New Roman" w:hAnsi="Times New Roman" w:cs="Times New Roman"/>
+        </w:rPr>
+        <w:t>mide</w:t>
+      </w:r>
+      <w:proofErr w:type="spellEnd"/>
+      <w:r>
+        <w:rPr>
+          <w:rFonts w:ascii="Times New Roman" w:hAnsi="Times New Roman" w:cs="Times New Roman"/>
+        </w:rPr>
+        <w:t xml:space="preserve"> el </w:t>
+      </w:r>
+      <w:proofErr w:type="spellStart"/>
+      <w:r>
+        <w:rPr>
+          <w:rFonts w:ascii="Times New Roman" w:hAnsi="Times New Roman" w:cs="Times New Roman"/>
+        </w:rPr>
+        <w:t>tiempo</w:t>
+      </w:r>
+      <w:proofErr w:type="spellEnd"/>
+      <w:r>
+        <w:rPr>
+          <w:rFonts w:ascii="Times New Roman" w:hAnsi="Times New Roman" w:cs="Times New Roman"/>
+        </w:rPr>
+        <w:t xml:space="preserve"> real total </w:t>
+      </w:r>
+      <w:proofErr w:type="spellStart"/>
+      <w:r>
+        <w:rPr>
+          <w:rFonts w:ascii="Times New Roman" w:hAnsi="Times New Roman" w:cs="Times New Roman"/>
+        </w:rPr>
+        <w:t>que</w:t>
+      </w:r>
+      <w:proofErr w:type="spellEnd"/>
+      <w:r>
+        <w:rPr>
+          <w:rFonts w:ascii="Times New Roman" w:hAnsi="Times New Roman" w:cs="Times New Roman"/>
+        </w:rPr>
+        <w:t xml:space="preserve"> </w:t>
+      </w:r>
+      <w:proofErr w:type="spellStart"/>
+      <w:r>
+        <w:rPr>
+          <w:rFonts w:ascii="Times New Roman" w:hAnsi="Times New Roman" w:cs="Times New Roman"/>
+        </w:rPr>
+        <w:t>pasa</w:t>
+      </w:r>
+      <w:proofErr w:type="spellEnd"/>
+      <w:r>
+        <w:rPr>
+          <w:rFonts w:ascii="Times New Roman" w:hAnsi="Times New Roman" w:cs="Times New Roman"/>
+        </w:rPr>
+        <w:t xml:space="preserve"> </w:t>
+      </w:r>
+      <w:proofErr w:type="spellStart"/>
+      <w:r>
+        <w:rPr>
+          <w:rFonts w:ascii="Times New Roman" w:hAnsi="Times New Roman" w:cs="Times New Roman"/>
+        </w:rPr>
+        <w:t>en</w:t>
+      </w:r>
+      <w:proofErr w:type="spellEnd"/>
+      <w:r>
+        <w:rPr>
+          <w:rFonts w:ascii="Times New Roman" w:hAnsi="Times New Roman" w:cs="Times New Roman"/>
+        </w:rPr>
+        <w:t xml:space="preserve"> el </w:t>
+      </w:r>
+      <w:proofErr w:type="spellStart"/>
+      <w:r>
+        <w:rPr>
+          <w:rFonts w:ascii="Times New Roman" w:hAnsi="Times New Roman" w:cs="Times New Roman"/>
+        </w:rPr>
+        <w:t>reloj</w:t>
+      </w:r>
+      <w:proofErr w:type="spellEnd"/>
+      <w:r>
+        <w:rPr>
+          <w:rFonts w:ascii="Times New Roman" w:hAnsi="Times New Roman" w:cs="Times New Roman"/>
+        </w:rPr>
+        <w:t xml:space="preserve"> </w:t>
+      </w:r>
+      <w:proofErr w:type="spellStart"/>
+      <w:r>
+        <w:rPr>
+          <w:rFonts w:ascii="Times New Roman" w:hAnsi="Times New Roman" w:cs="Times New Roman"/>
+        </w:rPr>
+        <w:t>desde</w:t>
+      </w:r>
+      <w:proofErr w:type="spellEnd"/>
+      <w:r>
+        <w:rPr>
+          <w:rFonts w:ascii="Times New Roman" w:hAnsi="Times New Roman" w:cs="Times New Roman"/>
+        </w:rPr>
+        <w:t xml:space="preserve"> </w:t>
+      </w:r>
+      <w:proofErr w:type="spellStart"/>
+      <w:r>
+        <w:rPr>
+          <w:rFonts w:ascii="Times New Roman" w:hAnsi="Times New Roman" w:cs="Times New Roman"/>
+        </w:rPr>
+        <w:t>que</w:t>
+      </w:r>
+      <w:proofErr w:type="spellEnd"/>
+      <w:r>
+        <w:rPr>
+          <w:rFonts w:ascii="Times New Roman" w:hAnsi="Times New Roman" w:cs="Times New Roman"/>
+        </w:rPr>
+        <w:t xml:space="preserve"> </w:t>
+      </w:r>
+      <w:proofErr w:type="spellStart"/>
+      <w:r>
+        <w:rPr>
+          <w:rFonts w:ascii="Times New Roman" w:hAnsi="Times New Roman" w:cs="Times New Roman"/>
+        </w:rPr>
+        <w:t>arranca</w:t>
+      </w:r>
+      <w:proofErr w:type="spellEnd"/>
+      <w:r>
+        <w:rPr>
+          <w:rFonts w:ascii="Times New Roman" w:hAnsi="Times New Roman" w:cs="Times New Roman"/>
+        </w:rPr>
+        <w:t xml:space="preserve"> la </w:t>
+      </w:r>
+      <w:proofErr w:type="spellStart"/>
+      <w:r>
+        <w:rPr>
+          <w:rFonts w:ascii="Times New Roman" w:hAnsi="Times New Roman" w:cs="Times New Roman"/>
+        </w:rPr>
+        <w:t>prueba</w:t>
+      </w:r>
+      <w:proofErr w:type="spellEnd"/>
+      <w:r>
+        <w:rPr>
+          <w:rFonts w:ascii="Times New Roman" w:hAnsi="Times New Roman" w:cs="Times New Roman"/>
+        </w:rPr>
+        <w:t xml:space="preserve"> hasta </w:t>
+      </w:r>
+      <w:proofErr w:type="spellStart"/>
+      <w:r>
+        <w:rPr>
+          <w:rFonts w:ascii="Times New Roman" w:hAnsi="Times New Roman" w:cs="Times New Roman"/>
+        </w:rPr>
+        <w:t>que</w:t>
+      </w:r>
+      <w:proofErr w:type="spellEnd"/>
+      <w:r>
+        <w:rPr>
+          <w:rFonts w:ascii="Times New Roman" w:hAnsi="Times New Roman" w:cs="Times New Roman"/>
+        </w:rPr>
+        <w:t xml:space="preserve"> termina, </w:t>
+      </w:r>
+      <w:proofErr w:type="spellStart"/>
+      <w:r>
+        <w:rPr>
+          <w:rFonts w:ascii="Times New Roman" w:hAnsi="Times New Roman" w:cs="Times New Roman"/>
+        </w:rPr>
+        <w:t>incluyendo</w:t>
+      </w:r>
+      <w:proofErr w:type="spellEnd"/>
+      <w:r>
+        <w:rPr>
+          <w:rFonts w:ascii="Times New Roman" w:hAnsi="Times New Roman" w:cs="Times New Roman"/>
+        </w:rPr>
+        <w:t xml:space="preserve"> lo </w:t>
+      </w:r>
+      <w:proofErr w:type="spellStart"/>
+      <w:r>
+        <w:rPr>
+          <w:rFonts w:ascii="Times New Roman" w:hAnsi="Times New Roman" w:cs="Times New Roman"/>
+        </w:rPr>
+        <w:t>que</w:t>
+      </w:r>
+      <w:proofErr w:type="spellEnd"/>
+      <w:r>
+        <w:rPr>
+          <w:rFonts w:ascii="Times New Roman" w:hAnsi="Times New Roman" w:cs="Times New Roman"/>
+        </w:rPr>
+        <w:t xml:space="preserve"> se </w:t>
+      </w:r>
+      <w:proofErr w:type="spellStart"/>
+      <w:r>
+        <w:rPr>
+          <w:rFonts w:ascii="Times New Roman" w:hAnsi="Times New Roman" w:cs="Times New Roman"/>
+        </w:rPr>
+        <w:t>demora</w:t>
+      </w:r>
+      <w:proofErr w:type="spellEnd"/>
+      <w:r>
+        <w:rPr>
+          <w:rFonts w:ascii="Times New Roman" w:hAnsi="Times New Roman" w:cs="Times New Roman"/>
+        </w:rPr>
+        <w:t xml:space="preserve"> el </w:t>
+      </w:r>
+      <w:proofErr w:type="spellStart"/>
+      <w:r>
+        <w:rPr>
+          <w:rFonts w:ascii="Times New Roman" w:hAnsi="Times New Roman" w:cs="Times New Roman"/>
+        </w:rPr>
+        <w:t>sistema</w:t>
+      </w:r>
+      <w:proofErr w:type="spellEnd"/>
+      <w:r>
+        <w:rPr>
+          <w:rFonts w:ascii="Times New Roman" w:hAnsi="Times New Roman" w:cs="Times New Roman"/>
+        </w:rPr>
+        <w:t xml:space="preserve"> </w:t>
+      </w:r>
+      <w:proofErr w:type="spellStart"/>
+      <w:r>
+        <w:rPr>
+          <w:rFonts w:ascii="Times New Roman" w:hAnsi="Times New Roman" w:cs="Times New Roman"/>
+        </w:rPr>
+        <w:t>leyendo</w:t>
+      </w:r>
+      <w:proofErr w:type="spellEnd"/>
+      <w:r>
+        <w:rPr>
+          <w:rFonts w:ascii="Times New Roman" w:hAnsi="Times New Roman" w:cs="Times New Roman"/>
+        </w:rPr>
+        <w:t xml:space="preserve"> </w:t>
+      </w:r>
+      <w:proofErr w:type="spellStart"/>
+      <w:r>
+        <w:rPr>
+          <w:rFonts w:ascii="Times New Roman" w:hAnsi="Times New Roman" w:cs="Times New Roman"/>
+        </w:rPr>
+        <w:t>los</w:t>
+      </w:r>
+      <w:proofErr w:type="spellEnd"/>
+      <w:r>
+        <w:rPr>
+          <w:rFonts w:ascii="Times New Roman" w:hAnsi="Times New Roman" w:cs="Times New Roman"/>
+        </w:rPr>
+        <w:t xml:space="preserve"> </w:t>
+      </w:r>
+      <w:proofErr w:type="spellStart"/>
+      <w:r>
+        <w:rPr>
+          <w:rFonts w:ascii="Times New Roman" w:hAnsi="Times New Roman" w:cs="Times New Roman"/>
+        </w:rPr>
+        <w:t>archivos</w:t>
+      </w:r>
+      <w:proofErr w:type="spellEnd"/>
+      <w:r>
+        <w:rPr>
+          <w:rFonts w:ascii="Times New Roman" w:hAnsi="Times New Roman" w:cs="Times New Roman"/>
+        </w:rPr>
+        <w:t xml:space="preserve"> csv del disco. </w:t>
+      </w:r>
+      <w:proofErr w:type="spellStart"/>
+      <w:r>
+        <w:rPr>
+          <w:rFonts w:ascii="Times New Roman" w:hAnsi="Times New Roman" w:cs="Times New Roman"/>
+        </w:rPr>
+        <w:t>en</w:t>
+      </w:r>
+      <w:proofErr w:type="spellEnd"/>
+      <w:r>
+        <w:rPr>
+          <w:rFonts w:ascii="Times New Roman" w:hAnsi="Times New Roman" w:cs="Times New Roman"/>
+        </w:rPr>
+        <w:t xml:space="preserve"> </w:t>
+      </w:r>
+      <w:proofErr w:type="spellStart"/>
+      <w:r>
+        <w:rPr>
+          <w:rFonts w:ascii="Times New Roman" w:hAnsi="Times New Roman" w:cs="Times New Roman"/>
+        </w:rPr>
+        <w:t>cambio</w:t>
+      </w:r>
+      <w:proofErr w:type="spellEnd"/>
+      <w:r>
+        <w:rPr>
+          <w:rFonts w:ascii="Times New Roman" w:hAnsi="Times New Roman" w:cs="Times New Roman"/>
+        </w:rPr>
+        <w:t xml:space="preserve"> </w:t>
+      </w:r>
+      <w:r>
+        <w:rPr>
+          <w:rFonts w:ascii="Times New Roman" w:hAnsi="Times New Roman" w:cs="Times New Roman"/>
+        </w:rPr>
+        <w:t>process time</w:t>
+      </w:r>
+      <w:r>
+        <w:rPr>
+          <w:rFonts w:ascii="Times New Roman" w:hAnsi="Times New Roman" w:cs="Times New Roman"/>
+        </w:rPr>
+        <w:t xml:space="preserve"> solo </w:t>
+      </w:r>
+      <w:proofErr w:type="spellStart"/>
+      <w:r>
+        <w:rPr>
+          <w:rFonts w:ascii="Times New Roman" w:hAnsi="Times New Roman" w:cs="Times New Roman"/>
+        </w:rPr>
+        <w:t>mide</w:t>
+      </w:r>
+      <w:proofErr w:type="spellEnd"/>
+      <w:r>
+        <w:rPr>
+          <w:rFonts w:ascii="Times New Roman" w:hAnsi="Times New Roman" w:cs="Times New Roman"/>
+        </w:rPr>
+        <w:t xml:space="preserve"> el </w:t>
+      </w:r>
+      <w:proofErr w:type="spellStart"/>
+      <w:r>
+        <w:rPr>
+          <w:rFonts w:ascii="Times New Roman" w:hAnsi="Times New Roman" w:cs="Times New Roman"/>
+        </w:rPr>
+        <w:t>tiempo</w:t>
+      </w:r>
+      <w:proofErr w:type="spellEnd"/>
+      <w:r>
+        <w:rPr>
+          <w:rFonts w:ascii="Times New Roman" w:hAnsi="Times New Roman" w:cs="Times New Roman"/>
+        </w:rPr>
+        <w:t xml:space="preserve"> </w:t>
+      </w:r>
+      <w:proofErr w:type="spellStart"/>
+      <w:r>
+        <w:rPr>
+          <w:rFonts w:ascii="Times New Roman" w:hAnsi="Times New Roman" w:cs="Times New Roman"/>
+        </w:rPr>
+        <w:t>que</w:t>
+      </w:r>
+      <w:proofErr w:type="spellEnd"/>
+      <w:r>
+        <w:rPr>
+          <w:rFonts w:ascii="Times New Roman" w:hAnsi="Times New Roman" w:cs="Times New Roman"/>
+        </w:rPr>
+        <w:t xml:space="preserve"> la </w:t>
+      </w:r>
+      <w:proofErr w:type="spellStart"/>
+      <w:r>
+        <w:rPr>
+          <w:rFonts w:ascii="Times New Roman" w:hAnsi="Times New Roman" w:cs="Times New Roman"/>
+        </w:rPr>
+        <w:t>cpu</w:t>
+      </w:r>
+      <w:proofErr w:type="spellEnd"/>
+      <w:r>
+        <w:rPr>
+          <w:rFonts w:ascii="Times New Roman" w:hAnsi="Times New Roman" w:cs="Times New Roman"/>
+        </w:rPr>
+        <w:t xml:space="preserve"> </w:t>
+      </w:r>
+      <w:proofErr w:type="spellStart"/>
+      <w:r>
+        <w:rPr>
+          <w:rFonts w:ascii="Times New Roman" w:hAnsi="Times New Roman" w:cs="Times New Roman"/>
+        </w:rPr>
+        <w:t>esta</w:t>
+      </w:r>
+      <w:proofErr w:type="spellEnd"/>
+      <w:r>
+        <w:rPr>
+          <w:rFonts w:ascii="Times New Roman" w:hAnsi="Times New Roman" w:cs="Times New Roman"/>
+        </w:rPr>
+        <w:t xml:space="preserve"> </w:t>
+      </w:r>
+      <w:proofErr w:type="spellStart"/>
+      <w:r>
+        <w:rPr>
+          <w:rFonts w:ascii="Times New Roman" w:hAnsi="Times New Roman" w:cs="Times New Roman"/>
+        </w:rPr>
+        <w:t>procesando</w:t>
+      </w:r>
+      <w:proofErr w:type="spellEnd"/>
+      <w:r>
+        <w:rPr>
+          <w:rFonts w:ascii="Times New Roman" w:hAnsi="Times New Roman" w:cs="Times New Roman"/>
+        </w:rPr>
+        <w:t xml:space="preserve"> </w:t>
+      </w:r>
+      <w:proofErr w:type="spellStart"/>
+      <w:r>
+        <w:rPr>
+          <w:rFonts w:ascii="Times New Roman" w:hAnsi="Times New Roman" w:cs="Times New Roman"/>
+        </w:rPr>
+        <w:t>codigo</w:t>
+      </w:r>
+      <w:proofErr w:type="spellEnd"/>
+      <w:r>
+        <w:rPr>
+          <w:rFonts w:ascii="Times New Roman" w:hAnsi="Times New Roman" w:cs="Times New Roman"/>
+        </w:rPr>
+        <w:t xml:space="preserve"> puro y </w:t>
+      </w:r>
+      <w:proofErr w:type="spellStart"/>
+      <w:r>
+        <w:rPr>
+          <w:rFonts w:ascii="Times New Roman" w:hAnsi="Times New Roman" w:cs="Times New Roman"/>
+        </w:rPr>
+        <w:t>omite</w:t>
+      </w:r>
+      <w:proofErr w:type="spellEnd"/>
+      <w:r>
+        <w:rPr>
+          <w:rFonts w:ascii="Times New Roman" w:hAnsi="Times New Roman" w:cs="Times New Roman"/>
+        </w:rPr>
+        <w:t xml:space="preserve"> </w:t>
+      </w:r>
+      <w:proofErr w:type="spellStart"/>
+      <w:r>
+        <w:rPr>
+          <w:rFonts w:ascii="Times New Roman" w:hAnsi="Times New Roman" w:cs="Times New Roman"/>
+        </w:rPr>
+        <w:t>los</w:t>
+      </w:r>
+      <w:proofErr w:type="spellEnd"/>
+      <w:r>
+        <w:rPr>
+          <w:rFonts w:ascii="Times New Roman" w:hAnsi="Times New Roman" w:cs="Times New Roman"/>
+        </w:rPr>
+        <w:t xml:space="preserve"> </w:t>
+      </w:r>
+      <w:proofErr w:type="spellStart"/>
+      <w:r>
+        <w:rPr>
+          <w:rFonts w:ascii="Times New Roman" w:hAnsi="Times New Roman" w:cs="Times New Roman"/>
+        </w:rPr>
+        <w:t>tiempos</w:t>
+      </w:r>
+      <w:proofErr w:type="spellEnd"/>
+      <w:r>
+        <w:rPr>
+          <w:rFonts w:ascii="Times New Roman" w:hAnsi="Times New Roman" w:cs="Times New Roman"/>
+        </w:rPr>
+        <w:t xml:space="preserve"> de </w:t>
+      </w:r>
+      <w:proofErr w:type="spellStart"/>
+      <w:r>
+        <w:rPr>
+          <w:rFonts w:ascii="Times New Roman" w:hAnsi="Times New Roman" w:cs="Times New Roman"/>
+        </w:rPr>
+        <w:t>espera</w:t>
+      </w:r>
+      <w:proofErr w:type="spellEnd"/>
+      <w:r>
+        <w:rPr>
+          <w:rFonts w:ascii="Times New Roman" w:hAnsi="Times New Roman" w:cs="Times New Roman"/>
+        </w:rPr>
+        <w:t xml:space="preserve"> de entrada y salida de </w:t>
+      </w:r>
+      <w:proofErr w:type="spellStart"/>
+      <w:r>
+        <w:rPr>
+          <w:rFonts w:ascii="Times New Roman" w:hAnsi="Times New Roman" w:cs="Times New Roman"/>
+        </w:rPr>
+        <w:t>datos</w:t>
+      </w:r>
+      <w:proofErr w:type="spellEnd"/>
+      <w:r>
+        <w:rPr>
+          <w:rFonts w:ascii="Times New Roman" w:hAnsi="Times New Roman" w:cs="Times New Roman"/>
+        </w:rPr>
+        <w:t xml:space="preserve">, lo </w:t>
+      </w:r>
+      <w:proofErr w:type="spellStart"/>
+      <w:r>
+        <w:rPr>
+          <w:rFonts w:ascii="Times New Roman" w:hAnsi="Times New Roman" w:cs="Times New Roman"/>
+        </w:rPr>
+        <w:t>cual</w:t>
+      </w:r>
+      <w:proofErr w:type="spellEnd"/>
+      <w:r>
+        <w:rPr>
+          <w:rFonts w:ascii="Times New Roman" w:hAnsi="Times New Roman" w:cs="Times New Roman"/>
+        </w:rPr>
+        <w:t xml:space="preserve"> </w:t>
+      </w:r>
+      <w:proofErr w:type="spellStart"/>
+      <w:r>
+        <w:rPr>
+          <w:rFonts w:ascii="Times New Roman" w:hAnsi="Times New Roman" w:cs="Times New Roman"/>
+        </w:rPr>
+        <w:t>nos</w:t>
+      </w:r>
+      <w:proofErr w:type="spellEnd"/>
+      <w:r>
+        <w:rPr>
+          <w:rFonts w:ascii="Times New Roman" w:hAnsi="Times New Roman" w:cs="Times New Roman"/>
+        </w:rPr>
+        <w:t xml:space="preserve"> </w:t>
+      </w:r>
+      <w:proofErr w:type="spellStart"/>
+      <w:r>
+        <w:rPr>
+          <w:rFonts w:ascii="Times New Roman" w:hAnsi="Times New Roman" w:cs="Times New Roman"/>
+        </w:rPr>
+        <w:t>daria</w:t>
+      </w:r>
+      <w:proofErr w:type="spellEnd"/>
+      <w:r>
+        <w:rPr>
+          <w:rFonts w:ascii="Times New Roman" w:hAnsi="Times New Roman" w:cs="Times New Roman"/>
+        </w:rPr>
+        <w:t xml:space="preserve"> un </w:t>
+      </w:r>
+      <w:proofErr w:type="spellStart"/>
+      <w:r>
+        <w:rPr>
+          <w:rFonts w:ascii="Times New Roman" w:hAnsi="Times New Roman" w:cs="Times New Roman"/>
+        </w:rPr>
+        <w:t>dato</w:t>
+      </w:r>
+      <w:proofErr w:type="spellEnd"/>
+      <w:r>
+        <w:rPr>
+          <w:rFonts w:ascii="Times New Roman" w:hAnsi="Times New Roman" w:cs="Times New Roman"/>
+        </w:rPr>
+        <w:t xml:space="preserve"> irreal para la carga del </w:t>
+      </w:r>
+      <w:proofErr w:type="spellStart"/>
+      <w:r>
+        <w:rPr>
+          <w:rFonts w:ascii="Times New Roman" w:hAnsi="Times New Roman" w:cs="Times New Roman"/>
+        </w:rPr>
+        <w:t>catalogo</w:t>
+      </w:r>
+      <w:proofErr w:type="spellEnd"/>
+      <w:r>
+        <w:rPr>
+          <w:rFonts w:ascii="Times New Roman" w:hAnsi="Times New Roman" w:cs="Times New Roman"/>
+        </w:rPr>
+        <w:t>.</w:t>
+      </w:r>
+      <w:r>
+        <w:rPr>
+          <w:rFonts w:ascii="Times New Roman" w:hAnsi="Times New Roman" w:cs="Times New Roman"/>
           <w:lang w:val="es-419"/>
         </w:rPr>
         <w:br/>
@@ -1995,6 +2815,7 @@
           <w:ilvl w:val="0"/>
           <w:numId w:val="13"/>
         </w:numPr>
+        <w:ind w:left="680"/>
         <w:jc w:val="both"/>
         <w:rPr>
           <w:lang w:val="es-419"/>
@@ -2006,33 +2827,29 @@
         </w:rPr>
         <w:t xml:space="preserve">¿Por qué son importantes las funciones </w:t>
       </w:r>
+      <w:proofErr w:type="spellStart"/>
       <w:r>
         <w:rPr>
           <w:b/>
           <w:bCs/>
           <w:lang w:val="es-419"/>
         </w:rPr>
-        <w:t>start()</w:t>
-      </w:r>
-      <w:r>
-        <w:rPr>
-          <w:lang w:val="es-419"/>
-        </w:rPr>
-        <w:t xml:space="preserve"> y </w:t>
-      </w:r>
+        <w:t>start</w:t>
+      </w:r>
+      <w:proofErr w:type="spellEnd"/>
       <w:r>
         <w:rPr>
           <w:b/>
           <w:bCs/>
           <w:lang w:val="es-419"/>
         </w:rPr>
-        <w:t>stop()</w:t>
+        <w:t>()</w:t>
       </w:r>
       <w:r>
         <w:rPr>
           <w:lang w:val="es-419"/>
         </w:rPr>
-        <w:t xml:space="preserve"> de la librería </w:t>
+        <w:t xml:space="preserve"> y </w:t>
       </w:r>
       <w:r>
         <w:rPr>
@@ -2040,8 +2857,24 @@
           <w:bCs/>
           <w:lang w:val="es-419"/>
         </w:rPr>
+        <w:t>stop()</w:t>
+      </w:r>
+      <w:r>
+        <w:rPr>
+          <w:lang w:val="es-419"/>
+        </w:rPr>
+        <w:t xml:space="preserve"> de la librería </w:t>
+      </w:r>
+      <w:proofErr w:type="spellStart"/>
+      <w:r>
+        <w:rPr>
+          <w:b/>
+          <w:bCs/>
+          <w:lang w:val="es-419"/>
+        </w:rPr>
         <w:t>tracemalloc</w:t>
       </w:r>
+      <w:proofErr w:type="spellEnd"/>
       <w:r>
         <w:rPr>
           <w:lang w:val="es-419"/>
@@ -2051,8 +2884,38 @@
     </w:p>
     <w:p>
       <w:pPr>
+        <w:ind w:left="680"/>
+        <w:jc w:val="both"/>
+        <w:rPr>
+          <w:lang w:val="es-419"/>
+        </w:rPr>
+      </w:pPr>
+      <w:r>
+        <w:rPr>
+          <w:lang w:val="es-419"/>
+        </w:rPr>
+        <w:t xml:space="preserve"> </w:t>
+      </w:r>
+      <w:r>
+        <w:t xml:space="preserve">sobre start y stop en tracemalloc start es clave porque le indica al interprete de python </w:t>
+      </w:r>
+      <w:r>
+        <w:t xml:space="preserve">  </w:t>
+      </w:r>
+      <w:r>
+        <w:t xml:space="preserve">que </w:t>
+      </w:r>
+      <w:r>
+        <w:t xml:space="preserve"> </w:t>
+      </w:r>
+      <w:r>
+        <w:t>empiece a monitorear todas las asignaciones de memoria que se van haciendo en tiempo de ejecucion. si no se llama antes, no se pueden tomar las capturas con snapshot. stop sirve para apagar ese rastreo y liberar la memoria y los recursos que usa la propia libreria para monitorear, evitando que meta ruido o vuelva mas lenta la aplicacion despues de medir.</w:t>
+      </w:r>
+    </w:p>
+    <w:p>
+      <w:pPr>
         <w:pStyle w:val="Prrafodelista"/>
-        <w:ind w:left="360"/>
+        <w:ind w:left="680"/>
         <w:jc w:val="both"/>
         <w:rPr>
           <w:lang w:val="es-419"/>
@@ -2066,6 +2929,7 @@
           <w:ilvl w:val="0"/>
           <w:numId w:val="13"/>
         </w:numPr>
+        <w:ind w:left="680"/>
         <w:jc w:val="both"/>
         <w:rPr>
           <w:lang w:val="es-419"/>
@@ -2109,7 +2973,291 @@
     <w:p>
       <w:pPr>
         <w:pStyle w:val="Prrafodelista"/>
-        <w:ind w:left="360"/>
+        <w:ind w:left="680"/>
+        <w:jc w:val="both"/>
+        <w:rPr>
+          <w:lang w:val="es-419"/>
+        </w:rPr>
+      </w:pPr>
+    </w:p>
+    <w:p>
+      <w:pPr>
+        <w:pStyle w:val="Prrafodelista"/>
+        <w:ind w:left="680"/>
+        <w:jc w:val="both"/>
+        <w:rPr>
+          <w:lang w:val="es-419"/>
+        </w:rPr>
+      </w:pPr>
+      <w:proofErr w:type="spellStart"/>
+      <w:r>
+        <w:t>sobre</w:t>
+      </w:r>
+      <w:proofErr w:type="spellEnd"/>
+      <w:r>
+        <w:t xml:space="preserve"> </w:t>
+      </w:r>
+      <w:proofErr w:type="spellStart"/>
+      <w:r>
+        <w:t>medir</w:t>
+      </w:r>
+      <w:proofErr w:type="spellEnd"/>
+      <w:r>
+        <w:t xml:space="preserve"> memoria y </w:t>
+      </w:r>
+      <w:proofErr w:type="spellStart"/>
+      <w:r>
+        <w:t>tiempo</w:t>
+      </w:r>
+      <w:proofErr w:type="spellEnd"/>
+      <w:r>
+        <w:t xml:space="preserve"> al </w:t>
+      </w:r>
+      <w:proofErr w:type="spellStart"/>
+      <w:r>
+        <w:t>mismo</w:t>
+      </w:r>
+      <w:proofErr w:type="spellEnd"/>
+      <w:r>
+        <w:t xml:space="preserve"> </w:t>
+      </w:r>
+      <w:proofErr w:type="spellStart"/>
+      <w:r>
+        <w:t>tiempo</w:t>
+      </w:r>
+      <w:proofErr w:type="spellEnd"/>
+      <w:r>
+        <w:t xml:space="preserve"> no es </w:t>
+      </w:r>
+      <w:proofErr w:type="spellStart"/>
+      <w:r>
+        <w:t>recomendable</w:t>
+      </w:r>
+      <w:proofErr w:type="spellEnd"/>
+      <w:r>
+        <w:t xml:space="preserve"> </w:t>
+      </w:r>
+      <w:proofErr w:type="spellStart"/>
+      <w:r>
+        <w:t>medirlos</w:t>
+      </w:r>
+      <w:proofErr w:type="spellEnd"/>
+      <w:r>
+        <w:t xml:space="preserve"> </w:t>
+      </w:r>
+      <w:proofErr w:type="spellStart"/>
+      <w:r>
+        <w:t>juntos</w:t>
+      </w:r>
+      <w:proofErr w:type="spellEnd"/>
+      <w:r>
+        <w:t xml:space="preserve"> de forma </w:t>
+      </w:r>
+      <w:proofErr w:type="spellStart"/>
+      <w:r>
+        <w:t>paralela</w:t>
+      </w:r>
+      <w:proofErr w:type="spellEnd"/>
+      <w:r>
+        <w:t xml:space="preserve"> </w:t>
+      </w:r>
+      <w:proofErr w:type="spellStart"/>
+      <w:r>
+        <w:t>porque</w:t>
+      </w:r>
+      <w:proofErr w:type="spellEnd"/>
+      <w:r>
+        <w:t xml:space="preserve"> la </w:t>
+      </w:r>
+      <w:proofErr w:type="spellStart"/>
+      <w:r>
+        <w:t>herramienta</w:t>
+      </w:r>
+      <w:proofErr w:type="spellEnd"/>
+      <w:r>
+        <w:t xml:space="preserve"> de </w:t>
+      </w:r>
+      <w:proofErr w:type="spellStart"/>
+      <w:r>
+        <w:t>rastreo</w:t>
+      </w:r>
+      <w:proofErr w:type="spellEnd"/>
+      <w:r>
+        <w:t xml:space="preserve"> de memoria </w:t>
+      </w:r>
+      <w:proofErr w:type="spellStart"/>
+      <w:r>
+        <w:t>agrega</w:t>
+      </w:r>
+      <w:proofErr w:type="spellEnd"/>
+      <w:r>
+        <w:t xml:space="preserve"> </w:t>
+      </w:r>
+      <w:proofErr w:type="spellStart"/>
+      <w:r>
+        <w:t>bastante</w:t>
+      </w:r>
+      <w:proofErr w:type="spellEnd"/>
+      <w:r>
+        <w:t xml:space="preserve"> </w:t>
+      </w:r>
+      <w:proofErr w:type="spellStart"/>
+      <w:r>
+        <w:t>trabajo</w:t>
+      </w:r>
+      <w:proofErr w:type="spellEnd"/>
+      <w:r>
+        <w:t xml:space="preserve"> extra al </w:t>
+      </w:r>
+      <w:proofErr w:type="spellStart"/>
+      <w:r>
+        <w:t>procesador</w:t>
+      </w:r>
+      <w:proofErr w:type="spellEnd"/>
+      <w:r>
+        <w:t xml:space="preserve"> al </w:t>
+      </w:r>
+      <w:proofErr w:type="spellStart"/>
+      <w:r>
+        <w:t>tener</w:t>
+      </w:r>
+      <w:proofErr w:type="spellEnd"/>
+      <w:r>
+        <w:t xml:space="preserve"> </w:t>
+      </w:r>
+      <w:proofErr w:type="spellStart"/>
+      <w:r>
+        <w:t>que</w:t>
+      </w:r>
+      <w:proofErr w:type="spellEnd"/>
+      <w:r>
+        <w:t xml:space="preserve"> </w:t>
+      </w:r>
+      <w:proofErr w:type="spellStart"/>
+      <w:r>
+        <w:t>inspeccionar</w:t>
+      </w:r>
+      <w:proofErr w:type="spellEnd"/>
+      <w:r>
+        <w:t xml:space="preserve"> </w:t>
+      </w:r>
+      <w:proofErr w:type="spellStart"/>
+      <w:r>
+        <w:t>cada</w:t>
+      </w:r>
+      <w:proofErr w:type="spellEnd"/>
+      <w:r>
+        <w:t xml:space="preserve"> variable y </w:t>
+      </w:r>
+      <w:proofErr w:type="spellStart"/>
+      <w:r>
+        <w:t>bloque</w:t>
+      </w:r>
+      <w:proofErr w:type="spellEnd"/>
+      <w:r>
+        <w:t xml:space="preserve"> </w:t>
+      </w:r>
+      <w:proofErr w:type="spellStart"/>
+      <w:r>
+        <w:t>que</w:t>
+      </w:r>
+      <w:proofErr w:type="spellEnd"/>
+      <w:r>
+        <w:t xml:space="preserve"> se </w:t>
+      </w:r>
+      <w:proofErr w:type="spellStart"/>
+      <w:r>
+        <w:t>crea</w:t>
+      </w:r>
+      <w:proofErr w:type="spellEnd"/>
+      <w:r>
+        <w:t xml:space="preserve">. </w:t>
+      </w:r>
+      <w:proofErr w:type="spellStart"/>
+      <w:r>
+        <w:t>esa</w:t>
+      </w:r>
+      <w:proofErr w:type="spellEnd"/>
+      <w:r>
+        <w:t xml:space="preserve"> carga </w:t>
+      </w:r>
+      <w:proofErr w:type="spellStart"/>
+      <w:r>
+        <w:t>adicional</w:t>
+      </w:r>
+      <w:proofErr w:type="spellEnd"/>
+      <w:r>
+        <w:t xml:space="preserve"> </w:t>
+      </w:r>
+      <w:proofErr w:type="spellStart"/>
+      <w:r>
+        <w:t>hace</w:t>
+      </w:r>
+      <w:proofErr w:type="spellEnd"/>
+      <w:r>
+        <w:t xml:space="preserve"> </w:t>
+      </w:r>
+      <w:proofErr w:type="spellStart"/>
+      <w:r>
+        <w:t>que</w:t>
+      </w:r>
+      <w:proofErr w:type="spellEnd"/>
+      <w:r>
+        <w:t xml:space="preserve"> la </w:t>
+      </w:r>
+      <w:proofErr w:type="spellStart"/>
+      <w:r>
+        <w:t>ejecucion</w:t>
+      </w:r>
+      <w:proofErr w:type="spellEnd"/>
+      <w:r>
+        <w:t xml:space="preserve"> se </w:t>
+      </w:r>
+      <w:proofErr w:type="spellStart"/>
+      <w:r>
+        <w:t>vuelva</w:t>
+      </w:r>
+      <w:proofErr w:type="spellEnd"/>
+      <w:r>
+        <w:t xml:space="preserve"> mas lenta de lo normal y termina </w:t>
+      </w:r>
+      <w:proofErr w:type="spellStart"/>
+      <w:r>
+        <w:t>distorsionando</w:t>
+      </w:r>
+      <w:proofErr w:type="spellEnd"/>
+      <w:r>
+        <w:t xml:space="preserve"> las </w:t>
+      </w:r>
+      <w:proofErr w:type="spellStart"/>
+      <w:r>
+        <w:t>mediciones</w:t>
+      </w:r>
+      <w:proofErr w:type="spellEnd"/>
+      <w:r>
+        <w:t xml:space="preserve"> de </w:t>
+      </w:r>
+      <w:proofErr w:type="spellStart"/>
+      <w:r>
+        <w:t>tiempo</w:t>
+      </w:r>
+      <w:proofErr w:type="spellEnd"/>
+      <w:r>
+        <w:t xml:space="preserve"> de las </w:t>
+      </w:r>
+      <w:proofErr w:type="spellStart"/>
+      <w:r>
+        <w:t>estructuras</w:t>
+      </w:r>
+      <w:proofErr w:type="spellEnd"/>
+      <w:r>
+        <w:t>.</w:t>
+      </w:r>
+    </w:p>
+    <w:p>
+      <w:pPr>
+        <w:pStyle w:val="Prrafodelista"/>
+        <w:ind w:left="680"/>
         <w:jc w:val="both"/>
         <w:rPr>
           <w:lang w:val="es-419"/>
@@ -2123,6 +3271,7 @@
           <w:ilvl w:val="0"/>
           <w:numId w:val="13"/>
         </w:numPr>
+        <w:ind w:left="680"/>
         <w:jc w:val="both"/>
         <w:rPr>
           <w:lang w:val="es-419"/>
@@ -2132,12 +3281,361 @@
         <w:rPr>
           <w:lang w:val="es-419"/>
         </w:rPr>
-        <w:t>Dado el número de elementos de los archivos (large), ¿Cuál sería el factor de carga para estos índices según su mecanismo de colisión?</w:t>
+        <w:t>Dado el número de elementos de los archivos (</w:t>
+      </w:r>
+      <w:proofErr w:type="spellStart"/>
+      <w:r>
+        <w:rPr>
+          <w:lang w:val="es-419"/>
+        </w:rPr>
+        <w:t>large</w:t>
+      </w:r>
+      <w:proofErr w:type="spellEnd"/>
+      <w:r>
+        <w:rPr>
+          <w:lang w:val="es-419"/>
+        </w:rPr>
+        <w:t>), ¿Cuál sería el factor de carga para estos índices según su mecanismo de colisión</w:t>
       </w:r>
     </w:p>
     <w:p>
       <w:pPr>
         <w:pStyle w:val="Prrafodelista"/>
+        <w:ind w:left="680"/>
+        <w:jc w:val="both"/>
+        <w:rPr>
+          <w:lang w:val="es-419"/>
+        </w:rPr>
+      </w:pPr>
+    </w:p>
+    <w:p>
+      <w:pPr>
+        <w:pStyle w:val="Prrafodelista"/>
+        <w:ind w:left="680"/>
+        <w:jc w:val="both"/>
+        <w:rPr>
+          <w:lang w:val="es-419"/>
+        </w:rPr>
+      </w:pPr>
+      <w:r>
+        <w:t xml:space="preserve">para linear probing el factor de carga ideal </w:t>
+      </w:r>
+      <w:proofErr w:type="spellStart"/>
+      <w:r>
+        <w:t>siempre</w:t>
+      </w:r>
+      <w:proofErr w:type="spellEnd"/>
+      <w:r>
+        <w:t xml:space="preserve"> </w:t>
+      </w:r>
+      <w:proofErr w:type="spellStart"/>
+      <w:r>
+        <w:t>debe</w:t>
+      </w:r>
+      <w:proofErr w:type="spellEnd"/>
+      <w:r>
+        <w:t xml:space="preserve"> </w:t>
+      </w:r>
+      <w:proofErr w:type="spellStart"/>
+      <w:r>
+        <w:t>mantenerse</w:t>
+      </w:r>
+      <w:proofErr w:type="spellEnd"/>
+      <w:r>
+        <w:t xml:space="preserve"> </w:t>
+      </w:r>
+      <w:proofErr w:type="spellStart"/>
+      <w:r>
+        <w:t>menor</w:t>
+      </w:r>
+      <w:proofErr w:type="spellEnd"/>
+      <w:r>
+        <w:t xml:space="preserve"> a 1.0, </w:t>
+      </w:r>
+      <w:proofErr w:type="spellStart"/>
+      <w:r>
+        <w:t>ojala</w:t>
+      </w:r>
+      <w:proofErr w:type="spellEnd"/>
+      <w:r>
+        <w:t xml:space="preserve"> entre 0.5 y 0.7 para </w:t>
+      </w:r>
+      <w:proofErr w:type="spellStart"/>
+      <w:r>
+        <w:t>que</w:t>
+      </w:r>
+      <w:proofErr w:type="spellEnd"/>
+      <w:r>
+        <w:t xml:space="preserve"> la </w:t>
+      </w:r>
+      <w:proofErr w:type="spellStart"/>
+      <w:r>
+        <w:t>tabla</w:t>
+      </w:r>
+      <w:proofErr w:type="spellEnd"/>
+      <w:r>
+        <w:t xml:space="preserve"> no se </w:t>
+      </w:r>
+      <w:proofErr w:type="spellStart"/>
+      <w:r>
+        <w:t>llene</w:t>
+      </w:r>
+      <w:proofErr w:type="spellEnd"/>
+      <w:r>
+        <w:t xml:space="preserve"> </w:t>
+      </w:r>
+      <w:proofErr w:type="spellStart"/>
+      <w:r>
+        <w:t>demasiado</w:t>
+      </w:r>
+      <w:proofErr w:type="spellEnd"/>
+      <w:r>
+        <w:t xml:space="preserve"> y no se </w:t>
+      </w:r>
+      <w:proofErr w:type="spellStart"/>
+      <w:r>
+        <w:t>formen</w:t>
+      </w:r>
+      <w:proofErr w:type="spellEnd"/>
+      <w:r>
+        <w:t xml:space="preserve"> </w:t>
+      </w:r>
+      <w:proofErr w:type="spellStart"/>
+      <w:r>
+        <w:t>bloques</w:t>
+      </w:r>
+      <w:proofErr w:type="spellEnd"/>
+      <w:r>
+        <w:t xml:space="preserve"> </w:t>
+      </w:r>
+      <w:proofErr w:type="spellStart"/>
+      <w:r>
+        <w:t>gigantes</w:t>
+      </w:r>
+      <w:proofErr w:type="spellEnd"/>
+      <w:r>
+        <w:t xml:space="preserve"> de </w:t>
+      </w:r>
+      <w:proofErr w:type="spellStart"/>
+      <w:r>
+        <w:t>elementos</w:t>
+      </w:r>
+      <w:proofErr w:type="spellEnd"/>
+      <w:r>
+        <w:t xml:space="preserve"> </w:t>
+      </w:r>
+      <w:proofErr w:type="spellStart"/>
+      <w:r>
+        <w:t>pegados</w:t>
+      </w:r>
+      <w:proofErr w:type="spellEnd"/>
+      <w:r>
+        <w:t xml:space="preserve"> </w:t>
+      </w:r>
+      <w:proofErr w:type="spellStart"/>
+      <w:r>
+        <w:t>que</w:t>
+      </w:r>
+      <w:proofErr w:type="spellEnd"/>
+      <w:r>
+        <w:t xml:space="preserve"> </w:t>
+      </w:r>
+      <w:proofErr w:type="spellStart"/>
+      <w:r>
+        <w:t>vuelvan</w:t>
+      </w:r>
+      <w:proofErr w:type="spellEnd"/>
+      <w:r>
+        <w:t xml:space="preserve"> </w:t>
+      </w:r>
+      <w:proofErr w:type="spellStart"/>
+      <w:r>
+        <w:t>lentas</w:t>
+      </w:r>
+      <w:proofErr w:type="spellEnd"/>
+      <w:r>
+        <w:t xml:space="preserve"> las </w:t>
+      </w:r>
+      <w:proofErr w:type="spellStart"/>
+      <w:r>
+        <w:t>busquedas</w:t>
+      </w:r>
+      <w:proofErr w:type="spellEnd"/>
+      <w:r>
+        <w:t xml:space="preserve">. para separate chaining </w:t>
+      </w:r>
+      <w:proofErr w:type="spellStart"/>
+      <w:r>
+        <w:t>como</w:t>
+      </w:r>
+      <w:proofErr w:type="spellEnd"/>
+      <w:r>
+        <w:t xml:space="preserve"> la </w:t>
+      </w:r>
+      <w:proofErr w:type="spellStart"/>
+      <w:r>
+        <w:t>colision</w:t>
+      </w:r>
+      <w:proofErr w:type="spellEnd"/>
+      <w:r>
+        <w:t xml:space="preserve"> se </w:t>
+      </w:r>
+      <w:proofErr w:type="spellStart"/>
+      <w:r>
+        <w:t>maneja</w:t>
+      </w:r>
+      <w:proofErr w:type="spellEnd"/>
+      <w:r>
+        <w:t xml:space="preserve"> con </w:t>
+      </w:r>
+      <w:proofErr w:type="spellStart"/>
+      <w:r>
+        <w:t>listas</w:t>
+      </w:r>
+      <w:proofErr w:type="spellEnd"/>
+      <w:r>
+        <w:t xml:space="preserve"> </w:t>
+      </w:r>
+      <w:proofErr w:type="spellStart"/>
+      <w:r>
+        <w:t>ligadas</w:t>
+      </w:r>
+      <w:proofErr w:type="spellEnd"/>
+      <w:r>
+        <w:t xml:space="preserve"> </w:t>
+      </w:r>
+      <w:proofErr w:type="spellStart"/>
+      <w:r>
+        <w:t>en</w:t>
+      </w:r>
+      <w:proofErr w:type="spellEnd"/>
+      <w:r>
+        <w:t xml:space="preserve"> </w:t>
+      </w:r>
+      <w:proofErr w:type="spellStart"/>
+      <w:r>
+        <w:t>cada</w:t>
+      </w:r>
+      <w:proofErr w:type="spellEnd"/>
+      <w:r>
+        <w:t xml:space="preserve"> </w:t>
+      </w:r>
+      <w:proofErr w:type="spellStart"/>
+      <w:r>
+        <w:t>posicion</w:t>
+      </w:r>
+      <w:proofErr w:type="spellEnd"/>
+      <w:r>
+        <w:t xml:space="preserve">, el factor de carga </w:t>
+      </w:r>
+      <w:proofErr w:type="spellStart"/>
+      <w:r>
+        <w:t>si</w:t>
+      </w:r>
+      <w:proofErr w:type="spellEnd"/>
+      <w:r>
+        <w:t xml:space="preserve"> </w:t>
+      </w:r>
+      <w:proofErr w:type="spellStart"/>
+      <w:r>
+        <w:t>puede</w:t>
+      </w:r>
+      <w:proofErr w:type="spellEnd"/>
+      <w:r>
+        <w:t xml:space="preserve"> ser mayor a 1.0, </w:t>
+      </w:r>
+      <w:proofErr w:type="spellStart"/>
+      <w:r>
+        <w:t>por</w:t>
+      </w:r>
+      <w:proofErr w:type="spellEnd"/>
+      <w:r>
+        <w:t xml:space="preserve"> </w:t>
+      </w:r>
+      <w:proofErr w:type="spellStart"/>
+      <w:r>
+        <w:t>ejemplo</w:t>
+      </w:r>
+      <w:proofErr w:type="spellEnd"/>
+      <w:r>
+        <w:t xml:space="preserve"> entre 2.0 y 4.0, lo </w:t>
+      </w:r>
+      <w:proofErr w:type="spellStart"/>
+      <w:r>
+        <w:t>cual</w:t>
+      </w:r>
+      <w:proofErr w:type="spellEnd"/>
+      <w:r>
+        <w:t xml:space="preserve"> </w:t>
+      </w:r>
+      <w:proofErr w:type="spellStart"/>
+      <w:r>
+        <w:t>representa</w:t>
+      </w:r>
+      <w:proofErr w:type="spellEnd"/>
+      <w:r>
+        <w:t xml:space="preserve"> el </w:t>
+      </w:r>
+      <w:proofErr w:type="spellStart"/>
+      <w:r>
+        <w:t>promedio</w:t>
+      </w:r>
+      <w:proofErr w:type="spellEnd"/>
+      <w:r>
+        <w:t xml:space="preserve"> de </w:t>
+      </w:r>
+      <w:proofErr w:type="spellStart"/>
+      <w:r>
+        <w:t>elementos</w:t>
+      </w:r>
+      <w:proofErr w:type="spellEnd"/>
+      <w:r>
+        <w:t xml:space="preserve"> </w:t>
+      </w:r>
+      <w:proofErr w:type="spellStart"/>
+      <w:r>
+        <w:t>colgados</w:t>
+      </w:r>
+      <w:proofErr w:type="spellEnd"/>
+      <w:r>
+        <w:t xml:space="preserve"> </w:t>
+      </w:r>
+      <w:proofErr w:type="spellStart"/>
+      <w:r>
+        <w:t>en</w:t>
+      </w:r>
+      <w:proofErr w:type="spellEnd"/>
+      <w:r>
+        <w:t xml:space="preserve"> </w:t>
+      </w:r>
+      <w:proofErr w:type="spellStart"/>
+      <w:r>
+        <w:t>cada</w:t>
+      </w:r>
+      <w:proofErr w:type="spellEnd"/>
+      <w:r>
+        <w:t xml:space="preserve"> </w:t>
+      </w:r>
+      <w:proofErr w:type="spellStart"/>
+      <w:r>
+        <w:t>lista</w:t>
+      </w:r>
+      <w:proofErr w:type="spellEnd"/>
+    </w:p>
+    <w:p>
+      <w:pPr>
+        <w:pStyle w:val="Prrafodelista"/>
+        <w:ind w:left="680"/>
+        <w:jc w:val="both"/>
+        <w:rPr>
+          <w:lang w:val="es-419"/>
+        </w:rPr>
+      </w:pPr>
+    </w:p>
+    <w:p>
+      <w:pPr>
+        <w:pStyle w:val="Prrafodelista"/>
+        <w:ind w:left="680"/>
         <w:rPr>
           <w:lang w:val="es-419"/>
         </w:rPr>
@@ -2150,6 +3648,7 @@
           <w:ilvl w:val="0"/>
           <w:numId w:val="13"/>
         </w:numPr>
+        <w:ind w:left="680"/>
         <w:jc w:val="both"/>
         <w:rPr>
           <w:lang w:val="es-419"/>
@@ -2165,6 +3664,303 @@
     <w:p>
       <w:pPr>
         <w:pStyle w:val="Prrafodelista"/>
+        <w:ind w:left="680"/>
+        <w:jc w:val="both"/>
+        <w:rPr>
+          <w:lang w:val="es-419"/>
+        </w:rPr>
+      </w:pPr>
+      <w:proofErr w:type="spellStart"/>
+      <w:r>
+        <w:t>cambios</w:t>
+      </w:r>
+      <w:proofErr w:type="spellEnd"/>
+      <w:r>
+        <w:t xml:space="preserve"> </w:t>
+      </w:r>
+      <w:proofErr w:type="spellStart"/>
+      <w:r>
+        <w:t>en</w:t>
+      </w:r>
+      <w:proofErr w:type="spellEnd"/>
+      <w:r>
+        <w:t xml:space="preserve"> el </w:t>
+      </w:r>
+      <w:proofErr w:type="spellStart"/>
+      <w:r>
+        <w:t>tiempo</w:t>
+      </w:r>
+      <w:proofErr w:type="spellEnd"/>
+      <w:r>
+        <w:t xml:space="preserve"> al </w:t>
+      </w:r>
+      <w:proofErr w:type="spellStart"/>
+      <w:r>
+        <w:t>cambiar</w:t>
+      </w:r>
+      <w:proofErr w:type="spellEnd"/>
+      <w:r>
+        <w:t xml:space="preserve"> el factor de carga a </w:t>
+      </w:r>
+      <w:proofErr w:type="spellStart"/>
+      <w:r>
+        <w:t>medida</w:t>
+      </w:r>
+      <w:proofErr w:type="spellEnd"/>
+      <w:r>
+        <w:t xml:space="preserve"> </w:t>
+      </w:r>
+      <w:proofErr w:type="spellStart"/>
+      <w:r>
+        <w:t>que</w:t>
+      </w:r>
+      <w:proofErr w:type="spellEnd"/>
+      <w:r>
+        <w:t xml:space="preserve"> el factor de carga </w:t>
+      </w:r>
+      <w:proofErr w:type="spellStart"/>
+      <w:r>
+        <w:t>aumenta</w:t>
+      </w:r>
+      <w:proofErr w:type="spellEnd"/>
+      <w:r>
+        <w:t xml:space="preserve"> </w:t>
+      </w:r>
+      <w:proofErr w:type="spellStart"/>
+      <w:r>
+        <w:t>en</w:t>
+      </w:r>
+      <w:proofErr w:type="spellEnd"/>
+      <w:r>
+        <w:t xml:space="preserve"> linear probing, el </w:t>
+      </w:r>
+      <w:proofErr w:type="spellStart"/>
+      <w:r>
+        <w:t>tiempo</w:t>
+      </w:r>
+      <w:proofErr w:type="spellEnd"/>
+      <w:r>
+        <w:t xml:space="preserve"> de </w:t>
+      </w:r>
+      <w:proofErr w:type="spellStart"/>
+      <w:r>
+        <w:t>ejecucion</w:t>
+      </w:r>
+      <w:proofErr w:type="spellEnd"/>
+      <w:r>
+        <w:t xml:space="preserve"> </w:t>
+      </w:r>
+      <w:proofErr w:type="spellStart"/>
+      <w:r>
+        <w:t>sube</w:t>
+      </w:r>
+      <w:proofErr w:type="spellEnd"/>
+      <w:r>
+        <w:t xml:space="preserve"> de forma </w:t>
+      </w:r>
+      <w:proofErr w:type="spellStart"/>
+      <w:r>
+        <w:t>muy</w:t>
+      </w:r>
+      <w:proofErr w:type="spellEnd"/>
+      <w:r>
+        <w:t xml:space="preserve"> </w:t>
+      </w:r>
+      <w:proofErr w:type="spellStart"/>
+      <w:r>
+        <w:t>marcada</w:t>
+      </w:r>
+      <w:proofErr w:type="spellEnd"/>
+      <w:r>
+        <w:t xml:space="preserve"> </w:t>
+      </w:r>
+      <w:proofErr w:type="spellStart"/>
+      <w:r>
+        <w:t>cuando</w:t>
+      </w:r>
+      <w:proofErr w:type="spellEnd"/>
+      <w:r>
+        <w:t xml:space="preserve"> el valor se </w:t>
+      </w:r>
+      <w:proofErr w:type="spellStart"/>
+      <w:r>
+        <w:t>acerca</w:t>
+      </w:r>
+      <w:proofErr w:type="spellEnd"/>
+      <w:r>
+        <w:t xml:space="preserve"> a 0.9. </w:t>
+      </w:r>
+      <w:proofErr w:type="spellStart"/>
+      <w:r>
+        <w:t>esto</w:t>
+      </w:r>
+      <w:proofErr w:type="spellEnd"/>
+      <w:r>
+        <w:t xml:space="preserve"> </w:t>
+      </w:r>
+      <w:proofErr w:type="spellStart"/>
+      <w:r>
+        <w:t>pasa</w:t>
+      </w:r>
+      <w:proofErr w:type="spellEnd"/>
+      <w:r>
+        <w:t xml:space="preserve"> </w:t>
+      </w:r>
+      <w:proofErr w:type="spellStart"/>
+      <w:r>
+        <w:t>porque</w:t>
+      </w:r>
+      <w:proofErr w:type="spellEnd"/>
+      <w:r>
+        <w:t xml:space="preserve"> al </w:t>
+      </w:r>
+      <w:proofErr w:type="spellStart"/>
+      <w:r>
+        <w:t>haber</w:t>
+      </w:r>
+      <w:proofErr w:type="spellEnd"/>
+      <w:r>
+        <w:t xml:space="preserve"> </w:t>
+      </w:r>
+      <w:proofErr w:type="spellStart"/>
+      <w:r>
+        <w:t>menos</w:t>
+      </w:r>
+      <w:proofErr w:type="spellEnd"/>
+      <w:r>
+        <w:t xml:space="preserve"> </w:t>
+      </w:r>
+      <w:proofErr w:type="spellStart"/>
+      <w:r>
+        <w:t>casillas</w:t>
+      </w:r>
+      <w:proofErr w:type="spellEnd"/>
+      <w:r>
+        <w:t xml:space="preserve"> </w:t>
+      </w:r>
+      <w:proofErr w:type="spellStart"/>
+      <w:r>
+        <w:t>libres</w:t>
+      </w:r>
+      <w:proofErr w:type="spellEnd"/>
+      <w:r>
+        <w:t xml:space="preserve"> </w:t>
+      </w:r>
+      <w:proofErr w:type="spellStart"/>
+      <w:r>
+        <w:t>aumentan</w:t>
+      </w:r>
+      <w:proofErr w:type="spellEnd"/>
+      <w:r>
+        <w:t xml:space="preserve"> las </w:t>
+      </w:r>
+      <w:proofErr w:type="spellStart"/>
+      <w:r>
+        <w:t>colisiones</w:t>
+      </w:r>
+      <w:proofErr w:type="spellEnd"/>
+      <w:r>
+        <w:t xml:space="preserve"> y el </w:t>
+      </w:r>
+      <w:proofErr w:type="spellStart"/>
+      <w:r>
+        <w:t>algoritmo</w:t>
+      </w:r>
+      <w:proofErr w:type="spellEnd"/>
+      <w:r>
+        <w:t xml:space="preserve"> </w:t>
+      </w:r>
+      <w:proofErr w:type="spellStart"/>
+      <w:r>
+        <w:t>tiene</w:t>
+      </w:r>
+      <w:proofErr w:type="spellEnd"/>
+      <w:r>
+        <w:t xml:space="preserve"> </w:t>
+      </w:r>
+      <w:proofErr w:type="spellStart"/>
+      <w:r>
+        <w:t>que</w:t>
+      </w:r>
+      <w:proofErr w:type="spellEnd"/>
+      <w:r>
+        <w:t xml:space="preserve"> </w:t>
+      </w:r>
+      <w:proofErr w:type="spellStart"/>
+      <w:r>
+        <w:t>recorrer</w:t>
+      </w:r>
+      <w:proofErr w:type="spellEnd"/>
+      <w:r>
+        <w:t xml:space="preserve"> </w:t>
+      </w:r>
+      <w:proofErr w:type="spellStart"/>
+      <w:r>
+        <w:t>secuencias</w:t>
+      </w:r>
+      <w:proofErr w:type="spellEnd"/>
+      <w:r>
+        <w:t xml:space="preserve"> de </w:t>
+      </w:r>
+      <w:proofErr w:type="spellStart"/>
+      <w:r>
+        <w:t>sondeo</w:t>
+      </w:r>
+      <w:proofErr w:type="spellEnd"/>
+      <w:r>
+        <w:t xml:space="preserve"> mas </w:t>
+      </w:r>
+      <w:proofErr w:type="spellStart"/>
+      <w:r>
+        <w:t>largas</w:t>
+      </w:r>
+      <w:proofErr w:type="spellEnd"/>
+      <w:r>
+        <w:t xml:space="preserve"> para encontrar un </w:t>
+      </w:r>
+      <w:proofErr w:type="spellStart"/>
+      <w:r>
+        <w:t>hueco</w:t>
+      </w:r>
+      <w:proofErr w:type="spellEnd"/>
+      <w:r>
+        <w:t xml:space="preserve"> disponible.</w:t>
+      </w:r>
+    </w:p>
+    <w:p>
+      <w:pPr>
+        <w:pStyle w:val="Prrafodelista"/>
+        <w:ind w:left="680"/>
+        <w:jc w:val="both"/>
+        <w:rPr>
+          <w:lang w:val="es-419"/>
+        </w:rPr>
+      </w:pPr>
+    </w:p>
+    <w:p>
+      <w:pPr>
+        <w:pStyle w:val="Prrafodelista"/>
+        <w:ind w:left="680"/>
+        <w:jc w:val="both"/>
+        <w:rPr>
+          <w:lang w:val="es-419"/>
+        </w:rPr>
+      </w:pPr>
+    </w:p>
+    <w:p>
+      <w:pPr>
+        <w:pStyle w:val="Prrafodelista"/>
+        <w:ind w:left="680"/>
+        <w:jc w:val="both"/>
+        <w:rPr>
+          <w:lang w:val="es-419"/>
+        </w:rPr>
+      </w:pPr>
+    </w:p>
+    <w:p>
+      <w:pPr>
+        <w:pStyle w:val="Prrafodelista"/>
+        <w:ind w:left="680"/>
         <w:rPr>
           <w:lang w:val="es-419"/>
         </w:rPr>
@@ -2177,6 +3973,7 @@
           <w:ilvl w:val="0"/>
           <w:numId w:val="13"/>
         </w:numPr>
+        <w:ind w:left="680"/>
         <w:jc w:val="both"/>
         <w:rPr>
           <w:lang w:val="es-419"/>
@@ -2192,6 +3989,208 @@
     <w:p>
       <w:pPr>
         <w:pStyle w:val="Prrafodelista"/>
+        <w:ind w:left="680"/>
+        <w:jc w:val="both"/>
+        <w:rPr>
+          <w:lang w:val="es-419"/>
+        </w:rPr>
+      </w:pPr>
+    </w:p>
+    <w:p>
+      <w:pPr>
+        <w:pStyle w:val="Prrafodelista"/>
+        <w:ind w:left="680"/>
+        <w:jc w:val="both"/>
+        <w:rPr>
+          <w:lang w:val="es-419"/>
+        </w:rPr>
+      </w:pPr>
+      <w:proofErr w:type="spellStart"/>
+      <w:r>
+        <w:t>cambios</w:t>
+      </w:r>
+      <w:proofErr w:type="spellEnd"/>
+      <w:r>
+        <w:t xml:space="preserve"> </w:t>
+      </w:r>
+      <w:proofErr w:type="spellStart"/>
+      <w:r>
+        <w:t>en</w:t>
+      </w:r>
+      <w:proofErr w:type="spellEnd"/>
+      <w:r>
+        <w:t xml:space="preserve"> la memoria al </w:t>
+      </w:r>
+      <w:proofErr w:type="spellStart"/>
+      <w:r>
+        <w:t>cambiar</w:t>
+      </w:r>
+      <w:proofErr w:type="spellEnd"/>
+      <w:r>
+        <w:t xml:space="preserve"> el factor de carga </w:t>
+      </w:r>
+      <w:proofErr w:type="spellStart"/>
+      <w:r>
+        <w:t>cuando</w:t>
+      </w:r>
+      <w:proofErr w:type="spellEnd"/>
+      <w:r>
+        <w:t xml:space="preserve"> se </w:t>
+      </w:r>
+      <w:proofErr w:type="spellStart"/>
+      <w:r>
+        <w:t>sube</w:t>
+      </w:r>
+      <w:proofErr w:type="spellEnd"/>
+      <w:r>
+        <w:t xml:space="preserve"> el factor de carga el </w:t>
+      </w:r>
+      <w:proofErr w:type="spellStart"/>
+      <w:r>
+        <w:t>consumo</w:t>
+      </w:r>
+      <w:proofErr w:type="spellEnd"/>
+      <w:r>
+        <w:t xml:space="preserve"> de memoria </w:t>
+      </w:r>
+      <w:proofErr w:type="spellStart"/>
+      <w:r>
+        <w:t>disminuye</w:t>
+      </w:r>
+      <w:proofErr w:type="spellEnd"/>
+      <w:r>
+        <w:t xml:space="preserve">. </w:t>
+      </w:r>
+      <w:proofErr w:type="spellStart"/>
+      <w:r>
+        <w:t>esto</w:t>
+      </w:r>
+      <w:proofErr w:type="spellEnd"/>
+      <w:r>
+        <w:t xml:space="preserve"> </w:t>
+      </w:r>
+      <w:proofErr w:type="spellStart"/>
+      <w:r>
+        <w:t>sucede</w:t>
+      </w:r>
+      <w:proofErr w:type="spellEnd"/>
+      <w:r>
+        <w:t xml:space="preserve"> </w:t>
+      </w:r>
+      <w:proofErr w:type="spellStart"/>
+      <w:r>
+        <w:t>porque</w:t>
+      </w:r>
+      <w:proofErr w:type="spellEnd"/>
+      <w:r>
+        <w:t xml:space="preserve"> se </w:t>
+      </w:r>
+      <w:proofErr w:type="spellStart"/>
+      <w:r>
+        <w:t>esta</w:t>
+      </w:r>
+      <w:proofErr w:type="spellEnd"/>
+      <w:r>
+        <w:t xml:space="preserve"> </w:t>
+      </w:r>
+      <w:proofErr w:type="spellStart"/>
+      <w:r>
+        <w:t>apretando</w:t>
+      </w:r>
+      <w:proofErr w:type="spellEnd"/>
+      <w:r>
+        <w:t xml:space="preserve"> mas la </w:t>
+      </w:r>
+      <w:proofErr w:type="spellStart"/>
+      <w:r>
+        <w:t>informacion</w:t>
+      </w:r>
+      <w:proofErr w:type="spellEnd"/>
+      <w:r>
+        <w:t xml:space="preserve"> </w:t>
+      </w:r>
+      <w:proofErr w:type="spellStart"/>
+      <w:r>
+        <w:t>dentro</w:t>
+      </w:r>
+      <w:proofErr w:type="spellEnd"/>
+      <w:r>
+        <w:t xml:space="preserve"> de un </w:t>
+      </w:r>
+      <w:proofErr w:type="spellStart"/>
+      <w:r>
+        <w:t>arreglo</w:t>
+      </w:r>
+      <w:proofErr w:type="spellEnd"/>
+      <w:r>
+        <w:t xml:space="preserve"> mas </w:t>
+      </w:r>
+      <w:proofErr w:type="spellStart"/>
+      <w:r>
+        <w:t>pequeño</w:t>
+      </w:r>
+      <w:proofErr w:type="spellEnd"/>
+      <w:r>
+        <w:t xml:space="preserve">, </w:t>
+      </w:r>
+      <w:proofErr w:type="spellStart"/>
+      <w:r>
+        <w:t>reduciendo</w:t>
+      </w:r>
+      <w:proofErr w:type="spellEnd"/>
+      <w:r>
+        <w:t xml:space="preserve"> la </w:t>
+      </w:r>
+      <w:proofErr w:type="spellStart"/>
+      <w:r>
+        <w:t>cantidad</w:t>
+      </w:r>
+      <w:proofErr w:type="spellEnd"/>
+      <w:r>
+        <w:t xml:space="preserve"> de </w:t>
+      </w:r>
+      <w:proofErr w:type="spellStart"/>
+      <w:r>
+        <w:t>casillas</w:t>
+      </w:r>
+      <w:proofErr w:type="spellEnd"/>
+      <w:r>
+        <w:t xml:space="preserve"> </w:t>
+      </w:r>
+      <w:proofErr w:type="spellStart"/>
+      <w:r>
+        <w:t>vacias</w:t>
+      </w:r>
+      <w:proofErr w:type="spellEnd"/>
+      <w:r>
+        <w:t xml:space="preserve"> o </w:t>
+      </w:r>
+      <w:proofErr w:type="spellStart"/>
+      <w:r>
+        <w:t>desperdiciadas</w:t>
+      </w:r>
+      <w:proofErr w:type="spellEnd"/>
+      <w:r>
+        <w:t xml:space="preserve"> </w:t>
+      </w:r>
+      <w:proofErr w:type="spellStart"/>
+      <w:r>
+        <w:t>en</w:t>
+      </w:r>
+      <w:proofErr w:type="spellEnd"/>
+      <w:r>
+        <w:t xml:space="preserve"> la </w:t>
+      </w:r>
+      <w:proofErr w:type="spellStart"/>
+      <w:r>
+        <w:t>estructura</w:t>
+      </w:r>
+      <w:proofErr w:type="spellEnd"/>
+    </w:p>
+    <w:p>
+      <w:pPr>
+        <w:pStyle w:val="Prrafodelista"/>
+        <w:ind w:left="680"/>
         <w:rPr>
           <w:lang w:val="es-419"/>
         </w:rPr>
@@ -2204,6 +4203,7 @@
           <w:ilvl w:val="0"/>
           <w:numId w:val="13"/>
         </w:numPr>
+        <w:ind w:left="680"/>
         <w:jc w:val="both"/>
         <w:rPr>
           <w:lang w:val="es-419"/>
@@ -2231,6 +4231,347 @@
     <w:p>
       <w:pPr>
         <w:pStyle w:val="Prrafodelista"/>
+        <w:ind w:left="680"/>
+        <w:jc w:val="both"/>
+        <w:rPr>
+          <w:lang w:val="es-419"/>
+        </w:rPr>
+      </w:pPr>
+    </w:p>
+    <w:p>
+      <w:pPr>
+        <w:pStyle w:val="Prrafodelista"/>
+        <w:ind w:left="680"/>
+        <w:jc w:val="both"/>
+        <w:rPr>
+          <w:lang w:val="es-419"/>
+        </w:rPr>
+      </w:pPr>
+      <w:proofErr w:type="spellStart"/>
+      <w:r>
+        <w:t>cambios</w:t>
+      </w:r>
+      <w:proofErr w:type="spellEnd"/>
+      <w:r>
+        <w:t xml:space="preserve"> </w:t>
+      </w:r>
+      <w:proofErr w:type="spellStart"/>
+      <w:r>
+        <w:t>en</w:t>
+      </w:r>
+      <w:proofErr w:type="spellEnd"/>
+      <w:r>
+        <w:t xml:space="preserve"> el </w:t>
+      </w:r>
+      <w:proofErr w:type="spellStart"/>
+      <w:r>
+        <w:t>tiempo</w:t>
+      </w:r>
+      <w:proofErr w:type="spellEnd"/>
+      <w:r>
+        <w:t xml:space="preserve"> </w:t>
+      </w:r>
+      <w:proofErr w:type="spellStart"/>
+      <w:r>
+        <w:t>segun</w:t>
+      </w:r>
+      <w:proofErr w:type="spellEnd"/>
+      <w:r>
+        <w:t xml:space="preserve"> el </w:t>
+      </w:r>
+      <w:proofErr w:type="spellStart"/>
+      <w:r>
+        <w:t>esquema</w:t>
+      </w:r>
+      <w:proofErr w:type="spellEnd"/>
+      <w:r>
+        <w:t xml:space="preserve"> de </w:t>
+      </w:r>
+      <w:proofErr w:type="spellStart"/>
+      <w:r>
+        <w:t>colisiones</w:t>
+      </w:r>
+      <w:proofErr w:type="spellEnd"/>
+      <w:r>
+        <w:t xml:space="preserve"> con </w:t>
+      </w:r>
+      <w:proofErr w:type="spellStart"/>
+      <w:r>
+        <w:t>factores</w:t>
+      </w:r>
+      <w:proofErr w:type="spellEnd"/>
+      <w:r>
+        <w:t xml:space="preserve"> de carga </w:t>
+      </w:r>
+      <w:proofErr w:type="spellStart"/>
+      <w:r>
+        <w:t>bajos</w:t>
+      </w:r>
+      <w:proofErr w:type="spellEnd"/>
+      <w:r>
+        <w:t xml:space="preserve"> linear probing </w:t>
+      </w:r>
+      <w:proofErr w:type="spellStart"/>
+      <w:r>
+        <w:t>suele</w:t>
+      </w:r>
+      <w:proofErr w:type="spellEnd"/>
+      <w:r>
+        <w:t xml:space="preserve"> ser mas </w:t>
+      </w:r>
+      <w:proofErr w:type="spellStart"/>
+      <w:r>
+        <w:t>rapido</w:t>
+      </w:r>
+      <w:proofErr w:type="spellEnd"/>
+      <w:r>
+        <w:t xml:space="preserve"> </w:t>
+      </w:r>
+      <w:proofErr w:type="spellStart"/>
+      <w:r>
+        <w:t>porque</w:t>
+      </w:r>
+      <w:proofErr w:type="spellEnd"/>
+      <w:r>
+        <w:t xml:space="preserve"> </w:t>
+      </w:r>
+      <w:proofErr w:type="spellStart"/>
+      <w:r>
+        <w:t>aprovecha</w:t>
+      </w:r>
+      <w:proofErr w:type="spellEnd"/>
+      <w:r>
+        <w:t xml:space="preserve"> </w:t>
+      </w:r>
+      <w:proofErr w:type="spellStart"/>
+      <w:r>
+        <w:t>mejor</w:t>
+      </w:r>
+      <w:proofErr w:type="spellEnd"/>
+      <w:r>
+        <w:t xml:space="preserve"> la memoria cache al </w:t>
+      </w:r>
+      <w:proofErr w:type="spellStart"/>
+      <w:r>
+        <w:t>tener</w:t>
+      </w:r>
+      <w:proofErr w:type="spellEnd"/>
+      <w:r>
+        <w:t xml:space="preserve"> </w:t>
+      </w:r>
+      <w:proofErr w:type="spellStart"/>
+      <w:r>
+        <w:t>los</w:t>
+      </w:r>
+      <w:proofErr w:type="spellEnd"/>
+      <w:r>
+        <w:t xml:space="preserve"> </w:t>
+      </w:r>
+      <w:proofErr w:type="spellStart"/>
+      <w:r>
+        <w:t>datos</w:t>
+      </w:r>
+      <w:proofErr w:type="spellEnd"/>
+      <w:r>
+        <w:t xml:space="preserve"> de forma continua </w:t>
+      </w:r>
+      <w:proofErr w:type="spellStart"/>
+      <w:r>
+        <w:t>en</w:t>
+      </w:r>
+      <w:proofErr w:type="spellEnd"/>
+      <w:r>
+        <w:t xml:space="preserve"> un </w:t>
+      </w:r>
+      <w:proofErr w:type="spellStart"/>
+      <w:r>
+        <w:t>arreglo</w:t>
+      </w:r>
+      <w:proofErr w:type="spellEnd"/>
+      <w:r>
+        <w:t xml:space="preserve">. </w:t>
+      </w:r>
+      <w:proofErr w:type="spellStart"/>
+      <w:r>
+        <w:t>pero</w:t>
+      </w:r>
+      <w:proofErr w:type="spellEnd"/>
+      <w:r>
+        <w:t xml:space="preserve"> </w:t>
+      </w:r>
+      <w:proofErr w:type="spellStart"/>
+      <w:r>
+        <w:t>cuando</w:t>
+      </w:r>
+      <w:proofErr w:type="spellEnd"/>
+      <w:r>
+        <w:t xml:space="preserve"> la </w:t>
+      </w:r>
+      <w:proofErr w:type="spellStart"/>
+      <w:r>
+        <w:t>tabla</w:t>
+      </w:r>
+      <w:proofErr w:type="spellEnd"/>
+      <w:r>
+        <w:t xml:space="preserve"> se </w:t>
+      </w:r>
+      <w:proofErr w:type="spellStart"/>
+      <w:r>
+        <w:t>llena</w:t>
+      </w:r>
+      <w:proofErr w:type="spellEnd"/>
+      <w:r>
+        <w:t xml:space="preserve"> separate chaining </w:t>
+      </w:r>
+      <w:proofErr w:type="spellStart"/>
+      <w:r>
+        <w:t>resulta</w:t>
+      </w:r>
+      <w:proofErr w:type="spellEnd"/>
+      <w:r>
+        <w:t xml:space="preserve"> mas </w:t>
+      </w:r>
+      <w:proofErr w:type="spellStart"/>
+      <w:r>
+        <w:t>estable</w:t>
+      </w:r>
+      <w:proofErr w:type="spellEnd"/>
+      <w:r>
+        <w:t xml:space="preserve"> </w:t>
+      </w:r>
+      <w:proofErr w:type="spellStart"/>
+      <w:r>
+        <w:t>en</w:t>
+      </w:r>
+      <w:proofErr w:type="spellEnd"/>
+      <w:r>
+        <w:t xml:space="preserve"> </w:t>
+      </w:r>
+      <w:proofErr w:type="spellStart"/>
+      <w:r>
+        <w:t>tiempo</w:t>
+      </w:r>
+      <w:proofErr w:type="spellEnd"/>
+      <w:r>
+        <w:t xml:space="preserve">, </w:t>
+      </w:r>
+      <w:proofErr w:type="spellStart"/>
+      <w:r>
+        <w:t>ya</w:t>
+      </w:r>
+      <w:proofErr w:type="spellEnd"/>
+      <w:r>
+        <w:t xml:space="preserve"> </w:t>
+      </w:r>
+      <w:proofErr w:type="spellStart"/>
+      <w:r>
+        <w:t>que</w:t>
+      </w:r>
+      <w:proofErr w:type="spellEnd"/>
+      <w:r>
+        <w:t xml:space="preserve"> al </w:t>
+      </w:r>
+      <w:proofErr w:type="spellStart"/>
+      <w:r>
+        <w:t>tener</w:t>
+      </w:r>
+      <w:proofErr w:type="spellEnd"/>
+      <w:r>
+        <w:t xml:space="preserve"> </w:t>
+      </w:r>
+      <w:proofErr w:type="spellStart"/>
+      <w:r>
+        <w:t>listas</w:t>
+      </w:r>
+      <w:proofErr w:type="spellEnd"/>
+      <w:r>
+        <w:t xml:space="preserve"> </w:t>
+      </w:r>
+      <w:proofErr w:type="spellStart"/>
+      <w:r>
+        <w:t>independientes</w:t>
+      </w:r>
+      <w:proofErr w:type="spellEnd"/>
+      <w:r>
+        <w:t xml:space="preserve"> </w:t>
+      </w:r>
+      <w:proofErr w:type="spellStart"/>
+      <w:r>
+        <w:t>en</w:t>
+      </w:r>
+      <w:proofErr w:type="spellEnd"/>
+      <w:r>
+        <w:t xml:space="preserve"> </w:t>
+      </w:r>
+      <w:proofErr w:type="spellStart"/>
+      <w:r>
+        <w:t>cada</w:t>
+      </w:r>
+      <w:proofErr w:type="spellEnd"/>
+      <w:r>
+        <w:t xml:space="preserve"> </w:t>
+      </w:r>
+      <w:proofErr w:type="spellStart"/>
+      <w:r>
+        <w:t>casilla</w:t>
+      </w:r>
+      <w:proofErr w:type="spellEnd"/>
+      <w:r>
+        <w:t xml:space="preserve"> </w:t>
+      </w:r>
+      <w:proofErr w:type="spellStart"/>
+      <w:r>
+        <w:t>evita</w:t>
+      </w:r>
+      <w:proofErr w:type="spellEnd"/>
+      <w:r>
+        <w:t xml:space="preserve"> el </w:t>
+      </w:r>
+      <w:proofErr w:type="spellStart"/>
+      <w:r>
+        <w:t>problema</w:t>
+      </w:r>
+      <w:proofErr w:type="spellEnd"/>
+      <w:r>
+        <w:t xml:space="preserve"> de </w:t>
+      </w:r>
+      <w:proofErr w:type="spellStart"/>
+      <w:r>
+        <w:t>acumulamiento</w:t>
+      </w:r>
+      <w:proofErr w:type="spellEnd"/>
+      <w:r>
+        <w:t xml:space="preserve"> </w:t>
+      </w:r>
+      <w:proofErr w:type="spellStart"/>
+      <w:r>
+        <w:t>masivo</w:t>
+      </w:r>
+      <w:proofErr w:type="spellEnd"/>
+      <w:r>
+        <w:t xml:space="preserve"> </w:t>
+      </w:r>
+      <w:proofErr w:type="spellStart"/>
+      <w:r>
+        <w:t>que</w:t>
+      </w:r>
+      <w:proofErr w:type="spellEnd"/>
+      <w:r>
+        <w:t xml:space="preserve"> </w:t>
+      </w:r>
+      <w:proofErr w:type="spellStart"/>
+      <w:r>
+        <w:t>frena</w:t>
+      </w:r>
+      <w:proofErr w:type="spellEnd"/>
+      <w:r>
+        <w:t xml:space="preserve"> a linear probing.</w:t>
+      </w:r>
+    </w:p>
+    <w:p>
+      <w:pPr>
+        <w:pStyle w:val="Prrafodelista"/>
+        <w:ind w:left="680"/>
         <w:rPr>
           <w:lang w:val="es-419"/>
         </w:rPr>
@@ -2243,6 +4584,7 @@
           <w:ilvl w:val="0"/>
           <w:numId w:val="13"/>
         </w:numPr>
+        <w:ind w:left="680"/>
         <w:jc w:val="both"/>
         <w:rPr>
           <w:lang w:val="es-419"/>
@@ -2265,6 +4607,274 @@
           <w:lang w:val="es-419"/>
         </w:rPr>
         <w:t>i los percibe, describa las diferencias y argumente su respuesta.</w:t>
+      </w:r>
+    </w:p>
+    <w:p>
+      <w:pPr>
+        <w:pStyle w:val="Prrafodelista"/>
+        <w:ind w:left="680"/>
+        <w:jc w:val="both"/>
+        <w:rPr>
+          <w:lang w:val="es-419"/>
+        </w:rPr>
+      </w:pPr>
+    </w:p>
+    <w:p>
+      <w:pPr>
+        <w:pStyle w:val="Prrafodelista"/>
+        <w:ind w:left="680"/>
+        <w:jc w:val="both"/>
+        <w:rPr>
+          <w:lang w:val="es-419"/>
+        </w:rPr>
+      </w:pPr>
+      <w:proofErr w:type="spellStart"/>
+      <w:r>
+        <w:t>cambios</w:t>
+      </w:r>
+      <w:proofErr w:type="spellEnd"/>
+      <w:r>
+        <w:t xml:space="preserve"> </w:t>
+      </w:r>
+      <w:proofErr w:type="spellStart"/>
+      <w:r>
+        <w:t>en</w:t>
+      </w:r>
+      <w:proofErr w:type="spellEnd"/>
+      <w:r>
+        <w:t xml:space="preserve"> la memoria </w:t>
+      </w:r>
+      <w:proofErr w:type="spellStart"/>
+      <w:r>
+        <w:t>segun</w:t>
+      </w:r>
+      <w:proofErr w:type="spellEnd"/>
+      <w:r>
+        <w:t xml:space="preserve"> el </w:t>
+      </w:r>
+      <w:proofErr w:type="spellStart"/>
+      <w:r>
+        <w:t>esquema</w:t>
+      </w:r>
+      <w:proofErr w:type="spellEnd"/>
+      <w:r>
+        <w:t xml:space="preserve"> de </w:t>
+      </w:r>
+      <w:proofErr w:type="spellStart"/>
+      <w:r>
+        <w:t>colisiones</w:t>
+      </w:r>
+      <w:proofErr w:type="spellEnd"/>
+      <w:r>
+        <w:t xml:space="preserve"> separate chaining consume un poco mas de memoria </w:t>
+      </w:r>
+      <w:proofErr w:type="spellStart"/>
+      <w:r>
+        <w:t>que</w:t>
+      </w:r>
+      <w:proofErr w:type="spellEnd"/>
+      <w:r>
+        <w:t xml:space="preserve"> linear probing </w:t>
+      </w:r>
+      <w:proofErr w:type="spellStart"/>
+      <w:r>
+        <w:t>porque</w:t>
+      </w:r>
+      <w:proofErr w:type="spellEnd"/>
+      <w:r>
+        <w:t xml:space="preserve"> </w:t>
+      </w:r>
+      <w:proofErr w:type="spellStart"/>
+      <w:r>
+        <w:t>requiere</w:t>
+      </w:r>
+      <w:proofErr w:type="spellEnd"/>
+      <w:r>
+        <w:t xml:space="preserve"> </w:t>
+      </w:r>
+      <w:proofErr w:type="spellStart"/>
+      <w:r>
+        <w:t>crear</w:t>
+      </w:r>
+      <w:proofErr w:type="spellEnd"/>
+      <w:r>
+        <w:t xml:space="preserve"> </w:t>
+      </w:r>
+      <w:proofErr w:type="spellStart"/>
+      <w:r>
+        <w:t>los</w:t>
+      </w:r>
+      <w:proofErr w:type="spellEnd"/>
+      <w:r>
+        <w:t xml:space="preserve"> </w:t>
+      </w:r>
+      <w:proofErr w:type="spellStart"/>
+      <w:r>
+        <w:t>nodos</w:t>
+      </w:r>
+      <w:proofErr w:type="spellEnd"/>
+      <w:r>
+        <w:t xml:space="preserve"> y </w:t>
+      </w:r>
+      <w:proofErr w:type="spellStart"/>
+      <w:r>
+        <w:t>guardar</w:t>
+      </w:r>
+      <w:proofErr w:type="spellEnd"/>
+      <w:r>
+        <w:t xml:space="preserve"> </w:t>
+      </w:r>
+      <w:proofErr w:type="spellStart"/>
+      <w:r>
+        <w:t>los</w:t>
+      </w:r>
+      <w:proofErr w:type="spellEnd"/>
+      <w:r>
+        <w:t xml:space="preserve"> </w:t>
+      </w:r>
+      <w:proofErr w:type="spellStart"/>
+      <w:r>
+        <w:t>punteros</w:t>
+      </w:r>
+      <w:proofErr w:type="spellEnd"/>
+      <w:r>
+        <w:t xml:space="preserve"> o </w:t>
+      </w:r>
+      <w:proofErr w:type="spellStart"/>
+      <w:r>
+        <w:t>referencias</w:t>
+      </w:r>
+      <w:proofErr w:type="spellEnd"/>
+      <w:r>
+        <w:t xml:space="preserve"> de la </w:t>
+      </w:r>
+      <w:proofErr w:type="spellStart"/>
+      <w:r>
+        <w:t>lista</w:t>
+      </w:r>
+      <w:proofErr w:type="spellEnd"/>
+      <w:r>
+        <w:t xml:space="preserve"> </w:t>
+      </w:r>
+      <w:proofErr w:type="spellStart"/>
+      <w:r>
+        <w:t>ligada</w:t>
+      </w:r>
+      <w:proofErr w:type="spellEnd"/>
+      <w:r>
+        <w:t xml:space="preserve"> para </w:t>
+      </w:r>
+      <w:proofErr w:type="spellStart"/>
+      <w:r>
+        <w:t>cada</w:t>
+      </w:r>
+      <w:proofErr w:type="spellEnd"/>
+      <w:r>
+        <w:t xml:space="preserve"> </w:t>
+      </w:r>
+      <w:proofErr w:type="spellStart"/>
+      <w:r>
+        <w:t>elemento</w:t>
+      </w:r>
+      <w:proofErr w:type="spellEnd"/>
+      <w:r>
+        <w:t xml:space="preserve">. </w:t>
+      </w:r>
+      <w:proofErr w:type="spellStart"/>
+      <w:r>
+        <w:t>en</w:t>
+      </w:r>
+      <w:proofErr w:type="spellEnd"/>
+      <w:r>
+        <w:t xml:space="preserve"> </w:t>
+      </w:r>
+      <w:proofErr w:type="spellStart"/>
+      <w:r>
+        <w:t>cambio</w:t>
+      </w:r>
+      <w:proofErr w:type="spellEnd"/>
+      <w:r>
+        <w:t xml:space="preserve"> linear probing </w:t>
+      </w:r>
+      <w:proofErr w:type="spellStart"/>
+      <w:r>
+        <w:t>guarda</w:t>
+      </w:r>
+      <w:proofErr w:type="spellEnd"/>
+      <w:r>
+        <w:t xml:space="preserve"> las entradas </w:t>
+      </w:r>
+      <w:proofErr w:type="spellStart"/>
+      <w:r>
+        <w:t>directamente</w:t>
+      </w:r>
+      <w:proofErr w:type="spellEnd"/>
+      <w:r>
+        <w:t xml:space="preserve"> </w:t>
+      </w:r>
+      <w:proofErr w:type="spellStart"/>
+      <w:r>
+        <w:t>sobre</w:t>
+      </w:r>
+      <w:proofErr w:type="spellEnd"/>
+      <w:r>
+        <w:t xml:space="preserve"> el </w:t>
+      </w:r>
+      <w:proofErr w:type="spellStart"/>
+      <w:r>
+        <w:t>arreglo</w:t>
+      </w:r>
+      <w:proofErr w:type="spellEnd"/>
+      <w:r>
+        <w:t xml:space="preserve"> sin </w:t>
+      </w:r>
+      <w:proofErr w:type="spellStart"/>
+      <w:r>
+        <w:t>necesidad</w:t>
+      </w:r>
+      <w:proofErr w:type="spellEnd"/>
+      <w:r>
+        <w:t xml:space="preserve"> de </w:t>
+      </w:r>
+      <w:proofErr w:type="spellStart"/>
+      <w:r>
+        <w:t>estructuras</w:t>
+      </w:r>
+      <w:proofErr w:type="spellEnd"/>
+      <w:r>
+        <w:t xml:space="preserve"> </w:t>
+      </w:r>
+      <w:proofErr w:type="spellStart"/>
+      <w:r>
+        <w:t>auxiliares</w:t>
+      </w:r>
+      <w:proofErr w:type="spellEnd"/>
+      <w:r>
+        <w:t xml:space="preserve"> </w:t>
+      </w:r>
+      <w:proofErr w:type="spellStart"/>
+      <w:r>
+        <w:t>adicionales</w:t>
+      </w:r>
+      <w:proofErr w:type="spellEnd"/>
+      <w:r>
+        <w:t xml:space="preserve"> </w:t>
+      </w:r>
+      <w:proofErr w:type="spellStart"/>
+      <w:r>
+        <w:t>por</w:t>
+      </w:r>
+      <w:proofErr w:type="spellEnd"/>
+      <w:r>
+        <w:t xml:space="preserve"> </w:t>
+      </w:r>
+      <w:proofErr w:type="spellStart"/>
+      <w:r>
+        <w:t>nodo</w:t>
+      </w:r>
+      <w:proofErr w:type="spellEnd"/>
+      <w:r>
+        <w:t>.</w:t>
       </w:r>
     </w:p>
     <w:p>
@@ -2273,6 +4883,7 @@
         <w:ind w:left="360"/>
         <w:jc w:val="both"/>
         <w:rPr>
+          <w:u w:val="single"/>
           <w:lang w:val="es-419"/>
         </w:rPr>
       </w:pPr>
@@ -4216,7 +6827,6 @@
   <w:style w:type="character" w:default="1" w:styleId="Fuentedeprrafopredeter">
     <w:name w:val="Default Paragraph Font"/>
     <w:uiPriority w:val="1"/>
-    <w:semiHidden/>
     <w:unhideWhenUsed/>
   </w:style>
   <w:style w:type="table" w:default="1" w:styleId="Tablanormal">
@@ -4802,6 +7412,26 @@
 </file>
 
 <file path=customXml/item1.xml><?xml version="1.0" encoding="utf-8"?>
+<p:properties xmlns:p="http://schemas.microsoft.com/office/2006/metadata/properties" xmlns:xsi="http://www.w3.org/2001/XMLSchema-instance" xmlns:pc="http://schemas.microsoft.com/office/infopath/2007/PartnerControls">
+  <documentManagement>
+    <TaxCatchAll xmlns="85e30bcc-d76c-4413-8e4d-2dce22fb0743" xsi:nil="true"/>
+    <lcf76f155ced4ddcb4097134ff3c332f xmlns="164883f8-7691-4ecf-b54a-664c0d0edefe">
+      <Terms xmlns="http://schemas.microsoft.com/office/infopath/2007/PartnerControls"/>
+    </lcf76f155ced4ddcb4097134ff3c332f>
+  </documentManagement>
+</p:properties>
+</file>
+
+<file path=customXml/item2.xml><?xml version="1.0" encoding="utf-8"?>
+<?mso-contentType ?>
+<FormTemplates xmlns="http://schemas.microsoft.com/sharepoint/v3/contenttype/forms">
+  <Display>DocumentLibraryForm</Display>
+  <Edit>DocumentLibraryForm</Edit>
+  <New>DocumentLibraryForm</New>
+</FormTemplates>
+</file>
+
+<file path=customXml/item3.xml><?xml version="1.0" encoding="utf-8"?>
 <ct:contentTypeSchema xmlns:ct="http://schemas.microsoft.com/office/2006/metadata/contentType" xmlns:ma="http://schemas.microsoft.com/office/2006/metadata/properties/metaAttributes" ct:_="" ma:_="" ma:contentTypeName="Documento" ma:contentTypeID="0x01010023858CF01A2EF24688B692775F4C60A4" ma:contentTypeVersion="17" ma:contentTypeDescription="Crear nuevo documento." ma:contentTypeScope="" ma:versionID="af74a0f8eb440a60883e9dd833f0742f">
   <xsd:schema xmlns:xsd="http://www.w3.org/2001/XMLSchema" xmlns:xs="http://www.w3.org/2001/XMLSchema" xmlns:p="http://schemas.microsoft.com/office/2006/metadata/properties" xmlns:ns2="164883f8-7691-4ecf-b54a-664c0d0edefe" xmlns:ns3="85e30bcc-d76c-4413-8e4d-2dce22fb0743" targetNamespace="http://schemas.microsoft.com/office/2006/metadata/properties" ma:root="true" ma:fieldsID="f5ceeff32ffca1089660572a8ebd1782" ns2:_="" ns3:_="">
     <xsd:import namespace="164883f8-7691-4ecf-b54a-664c0d0edefe"/>
@@ -5050,27 +7680,30 @@
 </ct:contentTypeSchema>
 </file>
 
-<file path=customXml/item2.xml><?xml version="1.0" encoding="utf-8"?>
-<?mso-contentType ?>
-<FormTemplates xmlns="http://schemas.microsoft.com/sharepoint/v3/contenttype/forms">
-  <Display>DocumentLibraryForm</Display>
-  <Edit>DocumentLibraryForm</Edit>
-  <New>DocumentLibraryForm</New>
-</FormTemplates>
-</file>
-
-<file path=customXml/item3.xml><?xml version="1.0" encoding="utf-8"?>
-<p:properties xmlns:p="http://schemas.microsoft.com/office/2006/metadata/properties" xmlns:xsi="http://www.w3.org/2001/XMLSchema-instance" xmlns:pc="http://schemas.microsoft.com/office/infopath/2007/PartnerControls">
-  <documentManagement>
-    <TaxCatchAll xmlns="85e30bcc-d76c-4413-8e4d-2dce22fb0743" xsi:nil="true"/>
-    <lcf76f155ced4ddcb4097134ff3c332f xmlns="164883f8-7691-4ecf-b54a-664c0d0edefe">
-      <Terms xmlns="http://schemas.microsoft.com/office/infopath/2007/PartnerControls"/>
-    </lcf76f155ced4ddcb4097134ff3c332f>
-  </documentManagement>
-</p:properties>
+<file path=customXml/item4.xml><?xml version="1.0" encoding="utf-8"?>
+<b:Sources xmlns:b="http://schemas.openxmlformats.org/officeDocument/2006/bibliography" xmlns="http://schemas.openxmlformats.org/officeDocument/2006/bibliography" SelectedStyle="\APASixthEditionOfficeOnline.xsl" StyleName="APA" Version="6"/>
 </file>
 
 <file path=customXml/itemProps1.xml><?xml version="1.0" encoding="utf-8"?>
+<ds:datastoreItem xmlns:ds="http://schemas.openxmlformats.org/officeDocument/2006/customXml" ds:itemID="{8542EACB-7939-45C8-99C3-B6897CA7A7EF}">
+  <ds:schemaRefs>
+    <ds:schemaRef ds:uri="http://schemas.microsoft.com/office/2006/metadata/properties"/>
+    <ds:schemaRef ds:uri="http://schemas.microsoft.com/office/infopath/2007/PartnerControls"/>
+    <ds:schemaRef ds:uri="85e30bcc-d76c-4413-8e4d-2dce22fb0743"/>
+    <ds:schemaRef ds:uri="164883f8-7691-4ecf-b54a-664c0d0edefe"/>
+  </ds:schemaRefs>
+</ds:datastoreItem>
+</file>
+
+<file path=customXml/itemProps2.xml><?xml version="1.0" encoding="utf-8"?>
+<ds:datastoreItem xmlns:ds="http://schemas.openxmlformats.org/officeDocument/2006/customXml" ds:itemID="{1F59EA8B-1FA8-40D2-A8B0-61B9CE1E4579}">
+  <ds:schemaRefs>
+    <ds:schemaRef ds:uri="http://schemas.microsoft.com/sharepoint/v3/contenttype/forms"/>
+  </ds:schemaRefs>
+</ds:datastoreItem>
+</file>
+
+<file path=customXml/itemProps3.xml><?xml version="1.0" encoding="utf-8"?>
 <ds:datastoreItem xmlns:ds="http://schemas.openxmlformats.org/officeDocument/2006/customXml" ds:itemID="{3D061157-43BE-4FE1-9C39-AC4CA83D3705}">
   <ds:schemaRefs>
     <ds:schemaRef ds:uri="http://schemas.microsoft.com/office/2006/metadata/contentType"/>
@@ -5089,21 +7722,10 @@
 </ds:datastoreItem>
 </file>
 
-<file path=customXml/itemProps2.xml><?xml version="1.0" encoding="utf-8"?>
-<ds:datastoreItem xmlns:ds="http://schemas.openxmlformats.org/officeDocument/2006/customXml" ds:itemID="{1F59EA8B-1FA8-40D2-A8B0-61B9CE1E4579}">
+<file path=customXml/itemProps4.xml><?xml version="1.0" encoding="utf-8"?>
+<ds:datastoreItem xmlns:ds="http://schemas.openxmlformats.org/officeDocument/2006/customXml" ds:itemID="{A4122E54-AC0A-41C9-BC14-23F049B3F414}">
   <ds:schemaRefs>
-    <ds:schemaRef ds:uri="http://schemas.microsoft.com/sharepoint/v3/contenttype/forms"/>
-  </ds:schemaRefs>
-</ds:datastoreItem>
-</file>
-
-<file path=customXml/itemProps3.xml><?xml version="1.0" encoding="utf-8"?>
-<ds:datastoreItem xmlns:ds="http://schemas.openxmlformats.org/officeDocument/2006/customXml" ds:itemID="{8542EACB-7939-45C8-99C3-B6897CA7A7EF}">
-  <ds:schemaRefs>
-    <ds:schemaRef ds:uri="http://schemas.microsoft.com/office/2006/metadata/properties"/>
-    <ds:schemaRef ds:uri="http://schemas.microsoft.com/office/infopath/2007/PartnerControls"/>
-    <ds:schemaRef ds:uri="85e30bcc-d76c-4413-8e4d-2dce22fb0743"/>
-    <ds:schemaRef ds:uri="164883f8-7691-4ecf-b54a-664c0d0edefe"/>
+    <ds:schemaRef ds:uri="http://schemas.openxmlformats.org/officeDocument/2006/bibliography"/>
   </ds:schemaRefs>
 </ds:datastoreItem>
 </file>
</xml_diff>